<commit_message>
added lecture and exercise
</commit_message>
<xml_diff>
--- a/Microsoft Full stack course/1. Foundations of coding full stack/3. Algorithms, flow charts and data types/Algorithms, flow charts and data types.docx
+++ b/Microsoft Full stack course/1. Foundations of coding full stack/3. Algorithms, flow charts and data types/Algorithms, flow charts and data types.docx
@@ -3766,7 +3766,11 @@
         </w:rPr>
       </w:pPr>
       <w:r>
-        <w:rPr/>
+        <w:rPr>
+          <w:sz w:val="28"/>
+          <w:szCs w:val="28"/>
+          <w:lang w:val="en-US"/>
+        </w:rPr>
         <w:drawing>
           <wp:anchor behindDoc="0" distT="0" distB="0" distL="0" distR="0" simplePos="0" locked="0" layoutInCell="0" allowOverlap="1" relativeHeight="2">
             <wp:simplePos x="0" y="0"/>
@@ -3866,15 +3870,17 @@
           <w:ilvl w:val="0"/>
           <w:numId w:val="0"/>
         </w:numPr>
-        <w:ind w:hanging="0"/>
-        <w:rPr>
-          <w:sz w:val="28"/>
-          <w:szCs w:val="28"/>
-          <w:lang w:val="en-US"/>
-        </w:rPr>
-      </w:pPr>
-      <w:r>
-        <w:rPr>
+        <w:ind w:left="0" w:hanging="0"/>
+        <w:rPr>
+          <w:sz w:val="28"/>
+          <w:szCs w:val="28"/>
+          <w:lang w:val="en-US"/>
+        </w:rPr>
+      </w:pPr>
+      <w:r>
+        <w:rPr>
+          <w:sz w:val="28"/>
+          <w:szCs w:val="28"/>
           <w:lang w:val="en-US"/>
         </w:rPr>
       </w:r>
@@ -3935,7 +3941,11 @@
         </w:rPr>
       </w:pPr>
       <w:r>
-        <w:rPr/>
+        <w:rPr>
+          <w:sz w:val="28"/>
+          <w:szCs w:val="28"/>
+          <w:lang w:val="en-US"/>
+        </w:rPr>
         <w:drawing>
           <wp:anchor behindDoc="0" distT="0" distB="0" distL="0" distR="0" simplePos="0" locked="0" layoutInCell="0" allowOverlap="1" relativeHeight="5">
             <wp:simplePos x="0" y="0"/>
@@ -3993,7 +4003,11 @@
         </w:rPr>
       </w:pPr>
       <w:r>
-        <w:rPr/>
+        <w:rPr>
+          <w:sz w:val="28"/>
+          <w:szCs w:val="28"/>
+          <w:lang w:val="en-US"/>
+        </w:rPr>
       </w:r>
     </w:p>
     <w:p>
@@ -4006,7 +4020,11 @@
         </w:rPr>
       </w:pPr>
       <w:r>
-        <w:rPr/>
+        <w:rPr>
+          <w:sz w:val="28"/>
+          <w:szCs w:val="28"/>
+          <w:lang w:val="en-US"/>
+        </w:rPr>
       </w:r>
     </w:p>
     <w:p>
@@ -4019,7 +4037,11 @@
         </w:rPr>
       </w:pPr>
       <w:r>
-        <w:rPr/>
+        <w:rPr>
+          <w:sz w:val="28"/>
+          <w:szCs w:val="28"/>
+          <w:lang w:val="en-US"/>
+        </w:rPr>
       </w:r>
     </w:p>
     <w:p>
@@ -4032,7 +4054,11 @@
         </w:rPr>
       </w:pPr>
       <w:r>
-        <w:rPr/>
+        <w:rPr>
+          <w:sz w:val="28"/>
+          <w:szCs w:val="28"/>
+          <w:lang w:val="en-US"/>
+        </w:rPr>
         <w:drawing>
           <wp:anchor behindDoc="0" distT="0" distB="0" distL="0" distR="0" simplePos="0" locked="0" layoutInCell="0" allowOverlap="1" relativeHeight="4">
             <wp:simplePos x="0" y="0"/>
@@ -4090,7 +4116,11 @@
         </w:rPr>
       </w:pPr>
       <w:r>
-        <w:rPr/>
+        <w:rPr>
+          <w:sz w:val="28"/>
+          <w:szCs w:val="28"/>
+          <w:lang w:val="en-US"/>
+        </w:rPr>
       </w:r>
     </w:p>
     <w:p>
@@ -4103,33 +4133,45 @@
         </w:rPr>
       </w:pPr>
       <w:r>
-        <w:rPr/>
-      </w:r>
-    </w:p>
-    <w:p>
-      <w:pPr>
-        <w:pStyle w:val="Normal"/>
-        <w:rPr>
-          <w:sz w:val="28"/>
-          <w:szCs w:val="28"/>
-          <w:lang w:val="en-US"/>
-        </w:rPr>
-      </w:pPr>
-      <w:r>
-        <w:rPr/>
-      </w:r>
-    </w:p>
-    <w:p>
-      <w:pPr>
-        <w:pStyle w:val="Normal"/>
-        <w:rPr>
-          <w:sz w:val="28"/>
-          <w:szCs w:val="28"/>
-          <w:lang w:val="en-US"/>
-        </w:rPr>
-      </w:pPr>
-      <w:r>
-        <w:rPr/>
+        <w:rPr>
+          <w:sz w:val="28"/>
+          <w:szCs w:val="28"/>
+          <w:lang w:val="en-US"/>
+        </w:rPr>
+      </w:r>
+    </w:p>
+    <w:p>
+      <w:pPr>
+        <w:pStyle w:val="Normal"/>
+        <w:rPr>
+          <w:sz w:val="28"/>
+          <w:szCs w:val="28"/>
+          <w:lang w:val="en-US"/>
+        </w:rPr>
+      </w:pPr>
+      <w:r>
+        <w:rPr>
+          <w:sz w:val="28"/>
+          <w:szCs w:val="28"/>
+          <w:lang w:val="en-US"/>
+        </w:rPr>
+      </w:r>
+    </w:p>
+    <w:p>
+      <w:pPr>
+        <w:pStyle w:val="Normal"/>
+        <w:rPr>
+          <w:sz w:val="28"/>
+          <w:szCs w:val="28"/>
+          <w:lang w:val="en-US"/>
+        </w:rPr>
+      </w:pPr>
+      <w:r>
+        <w:rPr>
+          <w:sz w:val="28"/>
+          <w:szCs w:val="28"/>
+          <w:lang w:val="en-US"/>
+        </w:rPr>
       </w:r>
     </w:p>
     <w:p>
@@ -4142,7 +4184,11 @@
         </w:rPr>
       </w:pPr>
       <w:r>
-        <w:rPr/>
+        <w:rPr>
+          <w:sz w:val="28"/>
+          <w:szCs w:val="28"/>
+          <w:lang w:val="en-US"/>
+        </w:rPr>
       </w:r>
     </w:p>
     <w:p>
@@ -4192,7 +4238,11 @@
         </w:rPr>
       </w:pPr>
       <w:r>
-        <w:rPr/>
+        <w:rPr>
+          <w:sz w:val="28"/>
+          <w:szCs w:val="28"/>
+          <w:lang w:val="en-US"/>
+        </w:rPr>
         <w:drawing>
           <wp:anchor behindDoc="0" distT="0" distB="0" distL="0" distR="0" simplePos="0" locked="0" layoutInCell="0" allowOverlap="1" relativeHeight="6">
             <wp:simplePos x="0" y="0"/>
@@ -4247,15 +4297,19 @@
           <w:ilvl w:val="0"/>
           <w:numId w:val="0"/>
         </w:numPr>
-        <w:ind w:hanging="0"/>
-        <w:rPr>
-          <w:sz w:val="28"/>
-          <w:szCs w:val="28"/>
-          <w:lang w:val="en-US"/>
-        </w:rPr>
-      </w:pPr>
-      <w:r>
-        <w:rPr/>
+        <w:ind w:left="0" w:hanging="0"/>
+        <w:rPr>
+          <w:sz w:val="28"/>
+          <w:szCs w:val="28"/>
+          <w:lang w:val="en-US"/>
+        </w:rPr>
+      </w:pPr>
+      <w:r>
+        <w:rPr>
+          <w:sz w:val="28"/>
+          <w:szCs w:val="28"/>
+          <w:lang w:val="en-US"/>
+        </w:rPr>
       </w:r>
     </w:p>
     <w:p>
@@ -4268,7 +4322,11 @@
         </w:rPr>
       </w:pPr>
       <w:r>
-        <w:rPr/>
+        <w:rPr>
+          <w:sz w:val="28"/>
+          <w:szCs w:val="28"/>
+          <w:lang w:val="en-US"/>
+        </w:rPr>
         <w:drawing>
           <wp:anchor behindDoc="0" distT="0" distB="0" distL="0" distR="0" simplePos="0" locked="0" layoutInCell="0" allowOverlap="1" relativeHeight="7">
             <wp:simplePos x="0" y="0"/>
@@ -4326,7 +4384,11 @@
         </w:rPr>
       </w:pPr>
       <w:r>
-        <w:rPr/>
+        <w:rPr>
+          <w:sz w:val="28"/>
+          <w:szCs w:val="28"/>
+          <w:lang w:val="en-US"/>
+        </w:rPr>
       </w:r>
     </w:p>
     <w:p>
@@ -4339,7 +4401,11 @@
         </w:rPr>
       </w:pPr>
       <w:r>
-        <w:rPr/>
+        <w:rPr>
+          <w:sz w:val="28"/>
+          <w:szCs w:val="28"/>
+          <w:lang w:val="en-US"/>
+        </w:rPr>
       </w:r>
     </w:p>
     <w:p>
@@ -4352,7 +4418,11 @@
         </w:rPr>
       </w:pPr>
       <w:r>
-        <w:rPr/>
+        <w:rPr>
+          <w:sz w:val="28"/>
+          <w:szCs w:val="28"/>
+          <w:lang w:val="en-US"/>
+        </w:rPr>
       </w:r>
     </w:p>
     <w:p>
@@ -4365,7 +4435,11 @@
         </w:rPr>
       </w:pPr>
       <w:r>
-        <w:rPr/>
+        <w:rPr>
+          <w:sz w:val="28"/>
+          <w:szCs w:val="28"/>
+          <w:lang w:val="en-US"/>
+        </w:rPr>
       </w:r>
     </w:p>
     <w:p>
@@ -4378,7 +4452,11 @@
         </w:rPr>
       </w:pPr>
       <w:r>
-        <w:rPr/>
+        <w:rPr>
+          <w:sz w:val="28"/>
+          <w:szCs w:val="28"/>
+          <w:lang w:val="en-US"/>
+        </w:rPr>
       </w:r>
     </w:p>
     <w:p>
@@ -4391,7 +4469,11 @@
         </w:rPr>
       </w:pPr>
       <w:r>
-        <w:rPr/>
+        <w:rPr>
+          <w:sz w:val="28"/>
+          <w:szCs w:val="28"/>
+          <w:lang w:val="en-US"/>
+        </w:rPr>
       </w:r>
     </w:p>
     <w:p>
@@ -4404,7 +4486,11 @@
         </w:rPr>
       </w:pPr>
       <w:r>
-        <w:rPr/>
+        <w:rPr>
+          <w:sz w:val="28"/>
+          <w:szCs w:val="28"/>
+          <w:lang w:val="en-US"/>
+        </w:rPr>
       </w:r>
     </w:p>
     <w:p>
@@ -4536,7 +4622,10 @@
         </w:rPr>
       </w:pPr>
       <w:r>
-        <w:rPr/>
+        <w:rPr>
+          <w:sz w:val="28"/>
+          <w:szCs w:val="28"/>
+        </w:rPr>
       </w:r>
     </w:p>
     <w:p>
@@ -4549,7 +4638,10 @@
         </w:rPr>
       </w:pPr>
       <w:r>
-        <w:rPr/>
+        <w:rPr>
+          <w:sz w:val="28"/>
+          <w:szCs w:val="28"/>
+        </w:rPr>
       </w:r>
     </w:p>
     <w:p>
@@ -4562,7 +4654,10 @@
         </w:rPr>
       </w:pPr>
       <w:r>
-        <w:rPr/>
+        <w:rPr>
+          <w:sz w:val="28"/>
+          <w:szCs w:val="28"/>
+        </w:rPr>
       </w:r>
     </w:p>
     <w:p>
@@ -4575,7 +4670,10 @@
         </w:rPr>
       </w:pPr>
       <w:r>
-        <w:rPr/>
+        <w:rPr>
+          <w:sz w:val="28"/>
+          <w:szCs w:val="28"/>
+        </w:rPr>
       </w:r>
     </w:p>
     <w:p>
@@ -4588,7 +4686,10 @@
         </w:rPr>
       </w:pPr>
       <w:r>
-        <w:rPr/>
+        <w:rPr>
+          <w:sz w:val="28"/>
+          <w:szCs w:val="28"/>
+        </w:rPr>
       </w:r>
     </w:p>
     <w:p>
@@ -4860,28 +4961,1079 @@
     </w:p>
     <w:p>
       <w:pPr>
+        <w:pStyle w:val="Heading1"/>
+        <w:rPr>
+          <w:b/>
+          <w:b/>
+          <w:bCs/>
+          <w:lang w:val="en-US"/>
+        </w:rPr>
+      </w:pPr>
+      <w:r>
+        <w:rPr>
+          <w:b/>
+          <w:bCs/>
+          <w:lang w:val="en-US"/>
+        </w:rPr>
+        <w:t>Variables in C#</w:t>
+      </w:r>
+    </w:p>
+    <w:p>
+      <w:pPr>
+        <w:pStyle w:val="TextBody"/>
+        <w:rPr/>
+      </w:pPr>
+      <w:r>
+        <w:rPr/>
+        <w:t>Variables are essential in C# programming, allowing developers to store, manipulate, and manage data efficiently. This reading covers the different types of variables, how to declare them, and the role of mutability and immutability in writing robust code.</w:t>
+      </w:r>
+    </w:p>
+    <w:p>
+      <w:pPr>
         <w:pStyle w:val="Heading2"/>
-        <w:rPr>
-          <w:sz w:val="28"/>
-          <w:szCs w:val="28"/>
-        </w:rPr>
-      </w:pPr>
-      <w:r>
-        <w:rPr/>
-        <w:t>Problems:</w:t>
+        <w:rPr/>
+      </w:pPr>
+      <w:r>
+        <w:rPr/>
+        <w:t>Understanding Variables</w:t>
       </w:r>
     </w:p>
     <w:p>
       <w:pPr>
         <w:pStyle w:val="TextBody"/>
-        <w:rPr>
-          <w:sz w:val="28"/>
-          <w:szCs w:val="28"/>
-        </w:rPr>
-      </w:pPr>
-      <w:r>
-        <w:rPr/>
-        <w:t>Using the examples provided, categorize the following values into their correct data types:</w:t>
+        <w:rPr/>
+      </w:pPr>
+      <w:r>
+        <w:rPr/>
+        <w:t>Variables are named storage locations in a program's memory used to store data. They enable developers to handle dynamic data by allowing updates and manipulation as needed during program execution. Variables are fundamental to any C# application, providing a way to manage data like user inputs, computation results, or configuration settings.</w:t>
+      </w:r>
+    </w:p>
+    <w:p>
+      <w:pPr>
+        <w:pStyle w:val="Heading3"/>
+        <w:rPr/>
+      </w:pPr>
+      <w:r>
+        <w:rPr/>
+        <w:t>Key Types of Variables</w:t>
+      </w:r>
+    </w:p>
+    <w:p>
+      <w:pPr>
+        <w:pStyle w:val="TextBody"/>
+        <w:numPr>
+          <w:ilvl w:val="0"/>
+          <w:numId w:val="15"/>
+        </w:numPr>
+        <w:tabs>
+          <w:tab w:val="clear" w:pos="708"/>
+          <w:tab w:val="left" w:pos="0" w:leader="none"/>
+        </w:tabs>
+        <w:ind w:left="709" w:hanging="283"/>
+        <w:rPr/>
+      </w:pPr>
+      <w:r>
+        <w:rPr/>
+        <w:t>Integer (</w:t>
+      </w:r>
+      <w:r>
+        <w:rPr>
+          <w:rStyle w:val="Variable"/>
+        </w:rPr>
+        <w:t>int</w:t>
+      </w:r>
+      <w:r>
+        <w:rPr/>
+        <w:t xml:space="preserve">): stores whole numbers, e.g., </w:t>
+      </w:r>
+      <w:r>
+        <w:rPr>
+          <w:rStyle w:val="Variable"/>
+        </w:rPr>
+        <w:t>int count = 10;</w:t>
+      </w:r>
+      <w:r>
+        <w:rPr/>
+        <w:t>.</w:t>
+      </w:r>
+    </w:p>
+    <w:p>
+      <w:pPr>
+        <w:pStyle w:val="TextBody"/>
+        <w:numPr>
+          <w:ilvl w:val="0"/>
+          <w:numId w:val="15"/>
+        </w:numPr>
+        <w:tabs>
+          <w:tab w:val="clear" w:pos="708"/>
+          <w:tab w:val="left" w:pos="0" w:leader="none"/>
+        </w:tabs>
+        <w:ind w:left="709" w:hanging="283"/>
+        <w:rPr/>
+      </w:pPr>
+      <w:r>
+        <w:rPr/>
+        <w:t>Double (</w:t>
+      </w:r>
+      <w:r>
+        <w:rPr>
+          <w:rStyle w:val="Variable"/>
+        </w:rPr>
+        <w:t>double</w:t>
+      </w:r>
+      <w:r>
+        <w:rPr/>
+        <w:t xml:space="preserve">): holds numeric values with decimals, e.g., </w:t>
+      </w:r>
+      <w:r>
+        <w:rPr>
+          <w:rStyle w:val="Variable"/>
+        </w:rPr>
+        <w:t>double price = 19.99;</w:t>
+      </w:r>
+      <w:r>
+        <w:rPr/>
+        <w:t>.</w:t>
+      </w:r>
+    </w:p>
+    <w:p>
+      <w:pPr>
+        <w:pStyle w:val="TextBody"/>
+        <w:numPr>
+          <w:ilvl w:val="0"/>
+          <w:numId w:val="15"/>
+        </w:numPr>
+        <w:tabs>
+          <w:tab w:val="clear" w:pos="708"/>
+          <w:tab w:val="left" w:pos="0" w:leader="none"/>
+        </w:tabs>
+        <w:ind w:left="709" w:hanging="283"/>
+        <w:rPr/>
+      </w:pPr>
+      <w:r>
+        <w:rPr/>
+        <w:t>String (</w:t>
+      </w:r>
+      <w:r>
+        <w:rPr>
+          <w:rStyle w:val="Variable"/>
+        </w:rPr>
+        <w:t>string</w:t>
+      </w:r>
+      <w:r>
+        <w:rPr/>
+        <w:t xml:space="preserve">): used for text data, e.g., </w:t>
+      </w:r>
+      <w:r>
+        <w:rPr>
+          <w:rStyle w:val="Variable"/>
+        </w:rPr>
+        <w:t>string name = "Alice";</w:t>
+      </w:r>
+      <w:r>
+        <w:rPr/>
+        <w:t>.</w:t>
+      </w:r>
+    </w:p>
+    <w:p>
+      <w:pPr>
+        <w:pStyle w:val="TextBody"/>
+        <w:numPr>
+          <w:ilvl w:val="0"/>
+          <w:numId w:val="15"/>
+        </w:numPr>
+        <w:tabs>
+          <w:tab w:val="clear" w:pos="708"/>
+          <w:tab w:val="left" w:pos="0" w:leader="none"/>
+        </w:tabs>
+        <w:ind w:left="709" w:hanging="283"/>
+        <w:rPr/>
+      </w:pPr>
+      <w:r>
+        <w:rPr/>
+        <w:t>Boolean (</w:t>
+      </w:r>
+      <w:r>
+        <w:rPr>
+          <w:rStyle w:val="Variable"/>
+        </w:rPr>
+        <w:t>bool</w:t>
+      </w:r>
+      <w:r>
+        <w:rPr/>
+        <w:t xml:space="preserve">): represents true or false values, e.g., </w:t>
+      </w:r>
+      <w:r>
+        <w:rPr>
+          <w:rStyle w:val="Variable"/>
+        </w:rPr>
+        <w:t>bool isValid = true;</w:t>
+      </w:r>
+      <w:r>
+        <w:rPr/>
+        <w:t>.</w:t>
+      </w:r>
+    </w:p>
+    <w:p>
+      <w:pPr>
+        <w:pStyle w:val="TextBody"/>
+        <w:numPr>
+          <w:ilvl w:val="0"/>
+          <w:numId w:val="15"/>
+        </w:numPr>
+        <w:tabs>
+          <w:tab w:val="clear" w:pos="708"/>
+          <w:tab w:val="left" w:pos="0" w:leader="none"/>
+        </w:tabs>
+        <w:ind w:left="709" w:hanging="283"/>
+        <w:rPr/>
+      </w:pPr>
+      <w:r>
+        <w:rPr/>
+        <w:t xml:space="preserve">Array: stores a collection of values of the same type, e.g., </w:t>
+      </w:r>
+      <w:r>
+        <w:rPr>
+          <w:rStyle w:val="Variable"/>
+        </w:rPr>
+        <w:t>int[] scores = {10, 20, 30};</w:t>
+      </w:r>
+      <w:r>
+        <w:rPr/>
+        <w:t>.</w:t>
+      </w:r>
+    </w:p>
+    <w:p>
+      <w:pPr>
+        <w:pStyle w:val="TextBody"/>
+        <w:rPr/>
+      </w:pPr>
+      <w:r>
+        <w:rPr/>
+        <w:t>Each type serves specific purposes and helps maintain clarity and precision in code by ensuring variables are used consistently.</w:t>
+      </w:r>
+    </w:p>
+    <w:p>
+      <w:pPr>
+        <w:pStyle w:val="Heading3"/>
+        <w:rPr/>
+      </w:pPr>
+      <w:r>
+        <w:rPr/>
+        <w:t>Declaring and Initializing Variables</w:t>
+      </w:r>
+    </w:p>
+    <w:p>
+      <w:pPr>
+        <w:pStyle w:val="TextBody"/>
+        <w:rPr/>
+      </w:pPr>
+      <w:r>
+        <w:rPr/>
+        <w:t>Declaring a variable in C# involves specifying its type, followed by its name, and optionally, its initial value. For example:</w:t>
+      </w:r>
+    </w:p>
+    <w:p>
+      <w:pPr>
+        <w:pStyle w:val="TextBody"/>
+        <w:rPr/>
+      </w:pPr>
+      <w:r>
+        <w:rPr>
+          <w:rStyle w:val="Variable"/>
+        </w:rPr>
+        <w:t xml:space="preserve">int age = 25; </w:t>
+      </w:r>
+    </w:p>
+    <w:p>
+      <w:pPr>
+        <w:pStyle w:val="TextBody"/>
+        <w:rPr/>
+      </w:pPr>
+      <w:r>
+        <w:rPr>
+          <w:rStyle w:val="Variable"/>
+        </w:rPr>
+        <w:t>string message = "Hello, World!";</w:t>
+      </w:r>
+    </w:p>
+    <w:p>
+      <w:pPr>
+        <w:pStyle w:val="TextBody"/>
+        <w:rPr/>
+      </w:pPr>
+      <w:r>
+        <w:rPr/>
+        <w:t>C# is a type-safe language, meaning that each variable must be declared with a specific data type, which helps prevent errors and improves code readability.</w:t>
+      </w:r>
+    </w:p>
+    <w:p>
+      <w:pPr>
+        <w:pStyle w:val="Heading3"/>
+        <w:rPr/>
+      </w:pPr>
+      <w:r>
+        <w:rPr/>
+        <w:t>Mutable vs. Immutable Variables</w:t>
+      </w:r>
+    </w:p>
+    <w:p>
+      <w:pPr>
+        <w:pStyle w:val="TextBody"/>
+        <w:numPr>
+          <w:ilvl w:val="0"/>
+          <w:numId w:val="16"/>
+        </w:numPr>
+        <w:tabs>
+          <w:tab w:val="clear" w:pos="708"/>
+          <w:tab w:val="left" w:pos="0" w:leader="none"/>
+        </w:tabs>
+        <w:ind w:left="709" w:hanging="283"/>
+        <w:rPr/>
+      </w:pPr>
+      <w:r>
+        <w:rPr/>
+        <w:t xml:space="preserve">Mutable Variables: Variables that can change their values after being declared. For example, declaring </w:t>
+      </w:r>
+      <w:r>
+        <w:rPr>
+          <w:rStyle w:val="Variable"/>
+        </w:rPr>
+        <w:t>int counter = 1;</w:t>
+      </w:r>
+      <w:r>
+        <w:rPr/>
+        <w:t xml:space="preserve"> allows you to change </w:t>
+      </w:r>
+      <w:r>
+        <w:rPr>
+          <w:rStyle w:val="Variable"/>
+        </w:rPr>
+        <w:t>counter</w:t>
+      </w:r>
+      <w:r>
+        <w:rPr/>
+        <w:t xml:space="preserve"> later in the code, such as </w:t>
+      </w:r>
+      <w:r>
+        <w:rPr>
+          <w:rStyle w:val="Variable"/>
+        </w:rPr>
+        <w:t>counter = 2;</w:t>
+      </w:r>
+      <w:r>
+        <w:rPr/>
+        <w:t>.</w:t>
+      </w:r>
+    </w:p>
+    <w:p>
+      <w:pPr>
+        <w:pStyle w:val="TextBody"/>
+        <w:numPr>
+          <w:ilvl w:val="0"/>
+          <w:numId w:val="16"/>
+        </w:numPr>
+        <w:tabs>
+          <w:tab w:val="clear" w:pos="708"/>
+          <w:tab w:val="left" w:pos="0" w:leader="none"/>
+        </w:tabs>
+        <w:ind w:left="709" w:hanging="283"/>
+        <w:rPr/>
+      </w:pPr>
+      <w:r>
+        <w:rPr/>
+        <w:t xml:space="preserve">Immutable Variables: Variables that cannot change once set. Declared using the </w:t>
+      </w:r>
+      <w:r>
+        <w:rPr>
+          <w:rStyle w:val="Variable"/>
+        </w:rPr>
+        <w:t>const</w:t>
+      </w:r>
+      <w:r>
+        <w:rPr/>
+        <w:t xml:space="preserve"> keyword (for compile-time constants) or </w:t>
+      </w:r>
+      <w:r>
+        <w:rPr>
+          <w:rStyle w:val="Variable"/>
+        </w:rPr>
+        <w:t>readonly</w:t>
+      </w:r>
+      <w:r>
+        <w:rPr/>
+        <w:t xml:space="preserve"> (for values assigned at runtime). For example: </w:t>
+      </w:r>
+      <w:r>
+        <w:rPr>
+          <w:rStyle w:val="Variable"/>
+        </w:rPr>
+        <w:t>const double PI = 3.14159;readonly int maxAttempts;</w:t>
+      </w:r>
+      <w:r>
+        <w:rPr/>
+        <w:t>.</w:t>
+      </w:r>
+    </w:p>
+    <w:p>
+      <w:pPr>
+        <w:pStyle w:val="TextBody"/>
+        <w:rPr/>
+      </w:pPr>
+      <w:r>
+        <w:rPr/>
+        <w:t>These keywords ensure that the variable values remain consistent throughout the program execution.</w:t>
+      </w:r>
+    </w:p>
+    <w:p>
+      <w:pPr>
+        <w:pStyle w:val="Heading3"/>
+        <w:rPr/>
+      </w:pPr>
+      <w:r>
+        <w:rPr/>
+        <w:t>Best Practices for Variable Management</w:t>
+      </w:r>
+    </w:p>
+    <w:p>
+      <w:pPr>
+        <w:pStyle w:val="TextBody"/>
+        <w:numPr>
+          <w:ilvl w:val="0"/>
+          <w:numId w:val="17"/>
+        </w:numPr>
+        <w:tabs>
+          <w:tab w:val="clear" w:pos="708"/>
+          <w:tab w:val="left" w:pos="0" w:leader="none"/>
+        </w:tabs>
+        <w:ind w:left="709" w:hanging="283"/>
+        <w:rPr/>
+      </w:pPr>
+      <w:r>
+        <w:rPr/>
+        <w:t xml:space="preserve">Use descriptive names: choose meaningful names for variables to improve code readability. For example, use </w:t>
+      </w:r>
+      <w:r>
+        <w:rPr>
+          <w:rStyle w:val="Variable"/>
+        </w:rPr>
+        <w:t>userAge</w:t>
+      </w:r>
+      <w:r>
+        <w:rPr/>
+        <w:t xml:space="preserve"> instead of </w:t>
+      </w:r>
+      <w:r>
+        <w:rPr>
+          <w:rStyle w:val="Variable"/>
+        </w:rPr>
+        <w:t>x</w:t>
+      </w:r>
+      <w:r>
+        <w:rPr/>
+        <w:t>.</w:t>
+      </w:r>
+    </w:p>
+    <w:p>
+      <w:pPr>
+        <w:pStyle w:val="TextBody"/>
+        <w:numPr>
+          <w:ilvl w:val="0"/>
+          <w:numId w:val="17"/>
+        </w:numPr>
+        <w:tabs>
+          <w:tab w:val="clear" w:pos="708"/>
+          <w:tab w:val="left" w:pos="0" w:leader="none"/>
+        </w:tabs>
+        <w:ind w:left="709" w:hanging="283"/>
+        <w:rPr/>
+      </w:pPr>
+      <w:r>
+        <w:rPr/>
+        <w:t xml:space="preserve">Follow naming conventions: in C#, use camelCase for local variables and method parameters (e.g., </w:t>
+      </w:r>
+      <w:r>
+        <w:rPr>
+          <w:rStyle w:val="Variable"/>
+        </w:rPr>
+        <w:t>totalAmount</w:t>
+      </w:r>
+      <w:r>
+        <w:rPr/>
+        <w:t>).</w:t>
+      </w:r>
+    </w:p>
+    <w:p>
+      <w:pPr>
+        <w:pStyle w:val="TextBody"/>
+        <w:numPr>
+          <w:ilvl w:val="0"/>
+          <w:numId w:val="17"/>
+        </w:numPr>
+        <w:tabs>
+          <w:tab w:val="clear" w:pos="708"/>
+          <w:tab w:val="left" w:pos="0" w:leader="none"/>
+        </w:tabs>
+        <w:ind w:left="709" w:hanging="283"/>
+        <w:rPr/>
+      </w:pPr>
+      <w:r>
+        <w:rPr/>
+        <w:t>Ensure correct data types: always match the data type to the data the variable will hold. Assigning a wrong type, like a string to an integer, results in a compile-time error.</w:t>
+      </w:r>
+    </w:p>
+    <w:p>
+      <w:pPr>
+        <w:pStyle w:val="Heading1"/>
+        <w:rPr>
+          <w:lang w:val="en-US"/>
+        </w:rPr>
+      </w:pPr>
+      <w:r>
+        <w:rPr>
+          <w:lang w:val="en-US"/>
+        </w:rPr>
+        <w:t xml:space="preserve">Activity – Declaring variables </w:t>
+      </w:r>
+    </w:p>
+    <w:p>
+      <w:pPr>
+        <w:pStyle w:val="Normal"/>
+        <w:rPr>
+          <w:lang w:val="en-US"/>
+        </w:rPr>
+      </w:pPr>
+      <w:r>
+        <w:rPr>
+          <w:lang w:val="en-US"/>
+        </w:rPr>
+      </w:r>
+    </w:p>
+    <w:p>
+      <w:pPr>
+        <w:pStyle w:val="Heading1"/>
+        <w:rPr>
+          <w:lang w:val="en-US"/>
+        </w:rPr>
+      </w:pPr>
+      <w:r>
+        <w:rPr>
+          <w:lang w:val="en-US"/>
+        </w:rPr>
+        <w:t>Example 1: Declaring and Initializing an Integer Variable</w:t>
+      </w:r>
+    </w:p>
+    <w:p>
+      <w:pPr>
+        <w:pStyle w:val="Heading2"/>
+        <w:rPr/>
+      </w:pPr>
+      <w:r>
+        <w:rPr/>
+        <w:t>Problem Statement:</w:t>
+      </w:r>
+    </w:p>
+    <w:p>
+      <w:pPr>
+        <w:pStyle w:val="TextBody"/>
+        <w:rPr/>
+      </w:pPr>
+      <w:r>
+        <w:rPr/>
+        <w:t>We need to declare a variable to store the number of students in a classroom and assign it an initial value of 25.</w:t>
+      </w:r>
+    </w:p>
+    <w:p>
+      <w:pPr>
+        <w:pStyle w:val="TextBody"/>
+        <w:rPr/>
+      </w:pPr>
+      <w:r>
+        <w:rPr/>
+        <w:t>1. Explanation:</w:t>
+      </w:r>
+    </w:p>
+    <w:p>
+      <w:pPr>
+        <w:pStyle w:val="TextBody"/>
+        <w:numPr>
+          <w:ilvl w:val="0"/>
+          <w:numId w:val="18"/>
+        </w:numPr>
+        <w:tabs>
+          <w:tab w:val="clear" w:pos="708"/>
+          <w:tab w:val="left" w:pos="0" w:leader="none"/>
+        </w:tabs>
+        <w:ind w:left="709" w:hanging="283"/>
+        <w:rPr/>
+      </w:pPr>
+      <w:r>
+        <w:rPr/>
+        <w:t xml:space="preserve">Step 1: Choosing the Data Type: Since the number of students is a whole number, an integer </w:t>
+      </w:r>
+      <w:r>
+        <w:rPr>
+          <w:rStyle w:val="Variable"/>
+        </w:rPr>
+        <w:t>(int)</w:t>
+      </w:r>
+      <w:r>
+        <w:rPr/>
+        <w:t xml:space="preserve"> is an appropriate data type.</w:t>
+      </w:r>
+    </w:p>
+    <w:p>
+      <w:pPr>
+        <w:pStyle w:val="TextBody"/>
+        <w:numPr>
+          <w:ilvl w:val="0"/>
+          <w:numId w:val="18"/>
+        </w:numPr>
+        <w:tabs>
+          <w:tab w:val="clear" w:pos="708"/>
+          <w:tab w:val="left" w:pos="0" w:leader="none"/>
+        </w:tabs>
+        <w:ind w:left="709" w:hanging="283"/>
+        <w:rPr/>
+      </w:pPr>
+      <w:r>
+        <w:rPr/>
+        <w:t xml:space="preserve">Step 2: Declaring the Variable: In C#, you declare a variable by specifying the data type, followed by the variable name. In this case, </w:t>
+      </w:r>
+      <w:r>
+        <w:rPr>
+          <w:rStyle w:val="Variable"/>
+        </w:rPr>
+        <w:t>int numberOfStudents</w:t>
+      </w:r>
+      <w:r>
+        <w:rPr/>
+        <w:t>.</w:t>
+      </w:r>
+    </w:p>
+    <w:p>
+      <w:pPr>
+        <w:pStyle w:val="TextBody"/>
+        <w:numPr>
+          <w:ilvl w:val="0"/>
+          <w:numId w:val="18"/>
+        </w:numPr>
+        <w:tabs>
+          <w:tab w:val="clear" w:pos="708"/>
+          <w:tab w:val="left" w:pos="0" w:leader="none"/>
+        </w:tabs>
+        <w:ind w:left="709" w:hanging="283"/>
+        <w:rPr/>
+      </w:pPr>
+      <w:r>
+        <w:rPr/>
+        <w:t xml:space="preserve">Step 3: Initializing the Variable: Initialization is the process of assigning an initial value to a variable at the time of declaration. We assign the value 25 to </w:t>
+      </w:r>
+      <w:r>
+        <w:rPr>
+          <w:rStyle w:val="Variable"/>
+        </w:rPr>
+        <w:t>numberOfStudents</w:t>
+      </w:r>
+      <w:r>
+        <w:rPr/>
+        <w:t xml:space="preserve"> using the assignment operator =.</w:t>
+      </w:r>
+    </w:p>
+    <w:p>
+      <w:pPr>
+        <w:pStyle w:val="TextBody"/>
+        <w:rPr/>
+      </w:pPr>
+      <w:r>
+        <w:rPr/>
+        <w:t xml:space="preserve">2. Code Example: </w:t>
+      </w:r>
+      <w:r>
+        <w:rPr>
+          <w:rStyle w:val="Variable"/>
+        </w:rPr>
+        <w:t>int numberOfStudents = 25;</w:t>
+      </w:r>
+    </w:p>
+    <w:p>
+      <w:pPr>
+        <w:pStyle w:val="TextBody"/>
+        <w:rPr/>
+      </w:pPr>
+      <w:r>
+        <w:rPr/>
+        <w:t>3. Explanation of the Code:</w:t>
+      </w:r>
+    </w:p>
+    <w:p>
+      <w:pPr>
+        <w:pStyle w:val="TextBody"/>
+        <w:numPr>
+          <w:ilvl w:val="0"/>
+          <w:numId w:val="19"/>
+        </w:numPr>
+        <w:tabs>
+          <w:tab w:val="clear" w:pos="708"/>
+          <w:tab w:val="left" w:pos="0" w:leader="none"/>
+        </w:tabs>
+        <w:ind w:left="709" w:hanging="283"/>
+        <w:rPr/>
+      </w:pPr>
+      <w:r>
+        <w:rPr>
+          <w:rStyle w:val="Variable"/>
+        </w:rPr>
+        <w:t>int</w:t>
+      </w:r>
+      <w:r>
+        <w:rPr/>
+        <w:t xml:space="preserve"> specifies the data type as an integer.</w:t>
+      </w:r>
+    </w:p>
+    <w:p>
+      <w:pPr>
+        <w:pStyle w:val="TextBody"/>
+        <w:numPr>
+          <w:ilvl w:val="0"/>
+          <w:numId w:val="19"/>
+        </w:numPr>
+        <w:tabs>
+          <w:tab w:val="clear" w:pos="708"/>
+          <w:tab w:val="left" w:pos="0" w:leader="none"/>
+        </w:tabs>
+        <w:ind w:left="709" w:hanging="283"/>
+        <w:rPr/>
+      </w:pPr>
+      <w:r>
+        <w:rPr>
+          <w:rStyle w:val="Variable"/>
+        </w:rPr>
+        <w:t>numberOfStudents</w:t>
+      </w:r>
+      <w:r>
+        <w:rPr/>
+        <w:t xml:space="preserve"> is the name of the variable.</w:t>
+      </w:r>
+    </w:p>
+    <w:p>
+      <w:pPr>
+        <w:pStyle w:val="TextBody"/>
+        <w:numPr>
+          <w:ilvl w:val="0"/>
+          <w:numId w:val="19"/>
+        </w:numPr>
+        <w:tabs>
+          <w:tab w:val="clear" w:pos="708"/>
+          <w:tab w:val="left" w:pos="0" w:leader="none"/>
+        </w:tabs>
+        <w:ind w:left="709" w:hanging="283"/>
+        <w:rPr/>
+      </w:pPr>
+      <w:r>
+        <w:rPr>
+          <w:rStyle w:val="Variable"/>
+        </w:rPr>
+        <w:t>=</w:t>
+      </w:r>
+      <w:r>
+        <w:rPr/>
+        <w:t xml:space="preserve"> is the assignment operator.</w:t>
+      </w:r>
+    </w:p>
+    <w:p>
+      <w:pPr>
+        <w:pStyle w:val="TextBody"/>
+        <w:numPr>
+          <w:ilvl w:val="0"/>
+          <w:numId w:val="19"/>
+        </w:numPr>
+        <w:tabs>
+          <w:tab w:val="clear" w:pos="708"/>
+          <w:tab w:val="left" w:pos="0" w:leader="none"/>
+        </w:tabs>
+        <w:ind w:left="709" w:hanging="283"/>
+        <w:rPr/>
+      </w:pPr>
+      <w:r>
+        <w:rPr>
+          <w:rStyle w:val="Variable"/>
+        </w:rPr>
+        <w:t xml:space="preserve">25 </w:t>
+      </w:r>
+      <w:r>
+        <w:rPr/>
+        <w:t xml:space="preserve">is the value assigned to </w:t>
+      </w:r>
+      <w:r>
+        <w:rPr>
+          <w:rStyle w:val="Variable"/>
+        </w:rPr>
+        <w:t>numberOfStudents</w:t>
+      </w:r>
+      <w:r>
+        <w:rPr/>
+        <w:t>.</w:t>
+      </w:r>
+    </w:p>
+    <w:p>
+      <w:pPr>
+        <w:pStyle w:val="Heading1"/>
+        <w:rPr/>
+      </w:pPr>
+      <w:r>
+        <w:rPr/>
+        <w:t>Example 2: Declaring and Initializing a String Variable</w:t>
+      </w:r>
+    </w:p>
+    <w:p>
+      <w:pPr>
+        <w:pStyle w:val="Heading2"/>
+        <w:rPr/>
+      </w:pPr>
+      <w:r>
+        <w:rPr/>
+        <w:t>Problem Statement:</w:t>
+      </w:r>
+    </w:p>
+    <w:p>
+      <w:pPr>
+        <w:pStyle w:val="TextBody"/>
+        <w:rPr/>
+      </w:pPr>
+      <w:r>
+        <w:rPr/>
+        <w:t>We need to store the name of a course in a variable and assign it an initial value of "Introduction to Programming".</w:t>
+      </w:r>
+    </w:p>
+    <w:p>
+      <w:pPr>
+        <w:pStyle w:val="TextBody"/>
+        <w:rPr/>
+      </w:pPr>
+      <w:r>
+        <w:rPr/>
+        <w:t>1. Explanation:</w:t>
+      </w:r>
+    </w:p>
+    <w:p>
+      <w:pPr>
+        <w:pStyle w:val="TextBody"/>
+        <w:numPr>
+          <w:ilvl w:val="0"/>
+          <w:numId w:val="20"/>
+        </w:numPr>
+        <w:tabs>
+          <w:tab w:val="clear" w:pos="708"/>
+          <w:tab w:val="left" w:pos="0" w:leader="none"/>
+        </w:tabs>
+        <w:ind w:left="709" w:hanging="283"/>
+        <w:rPr/>
+      </w:pPr>
+      <w:r>
+        <w:rPr/>
+        <w:t>Step 1: Choosing the Data Type: Since a course name consists of text, a string (</w:t>
+      </w:r>
+      <w:r>
+        <w:rPr>
+          <w:rStyle w:val="Variable"/>
+        </w:rPr>
+        <w:t>string</w:t>
+      </w:r>
+      <w:r>
+        <w:rPr/>
+        <w:t>) is the appropriate data type.</w:t>
+      </w:r>
+    </w:p>
+    <w:p>
+      <w:pPr>
+        <w:pStyle w:val="TextBody"/>
+        <w:numPr>
+          <w:ilvl w:val="0"/>
+          <w:numId w:val="20"/>
+        </w:numPr>
+        <w:tabs>
+          <w:tab w:val="clear" w:pos="708"/>
+          <w:tab w:val="left" w:pos="0" w:leader="none"/>
+        </w:tabs>
+        <w:ind w:left="709" w:hanging="283"/>
+        <w:rPr/>
+      </w:pPr>
+      <w:r>
+        <w:rPr/>
+        <w:t xml:space="preserve">Step 2: Declaring the Variable: In C#, you declare a string variable by specifying the data type string and then the variable name. In this example, </w:t>
+      </w:r>
+      <w:r>
+        <w:rPr>
+          <w:rStyle w:val="Variable"/>
+        </w:rPr>
+        <w:t>string courseName</w:t>
+      </w:r>
+      <w:r>
+        <w:rPr/>
+        <w:t>.</w:t>
+      </w:r>
+    </w:p>
+    <w:p>
+      <w:pPr>
+        <w:pStyle w:val="TextBody"/>
+        <w:numPr>
+          <w:ilvl w:val="0"/>
+          <w:numId w:val="20"/>
+        </w:numPr>
+        <w:tabs>
+          <w:tab w:val="clear" w:pos="708"/>
+          <w:tab w:val="left" w:pos="0" w:leader="none"/>
+        </w:tabs>
+        <w:ind w:left="709" w:hanging="283"/>
+        <w:rPr/>
+      </w:pPr>
+      <w:r>
+        <w:rPr/>
+        <w:t xml:space="preserve">Step 3: Initializing the Variable: We assign the text "Introduction to Programming" to </w:t>
+      </w:r>
+      <w:r>
+        <w:rPr>
+          <w:rStyle w:val="Variable"/>
+        </w:rPr>
+        <w:t>courseName</w:t>
+      </w:r>
+      <w:r>
+        <w:rPr/>
+        <w:t>. Text values are enclosed in double quotes.</w:t>
+      </w:r>
+    </w:p>
+    <w:p>
+      <w:pPr>
+        <w:pStyle w:val="TextBody"/>
+        <w:rPr/>
+      </w:pPr>
+      <w:r>
+        <w:rPr/>
+        <w:t xml:space="preserve">2. Code Example: </w:t>
+      </w:r>
+      <w:r>
+        <w:rPr>
+          <w:rStyle w:val="Variable"/>
+        </w:rPr>
+        <w:t xml:space="preserve">string courseName = "Introduction to Programming"; </w:t>
+      </w:r>
+      <w:r>
+        <w:rPr/>
+        <w:t>3. Explanation of the Code:</w:t>
+      </w:r>
+    </w:p>
+    <w:p>
+      <w:pPr>
+        <w:pStyle w:val="TextBody"/>
+        <w:numPr>
+          <w:ilvl w:val="0"/>
+          <w:numId w:val="21"/>
+        </w:numPr>
+        <w:tabs>
+          <w:tab w:val="clear" w:pos="708"/>
+          <w:tab w:val="left" w:pos="0" w:leader="none"/>
+        </w:tabs>
+        <w:ind w:left="709" w:hanging="283"/>
+        <w:rPr/>
+      </w:pPr>
+      <w:r>
+        <w:rPr>
+          <w:rStyle w:val="Variable"/>
+        </w:rPr>
+        <w:t>courseName</w:t>
+      </w:r>
+      <w:r>
+        <w:rPr/>
+        <w:t xml:space="preserve"> is the name of the variable.</w:t>
+      </w:r>
+    </w:p>
+    <w:p>
+      <w:pPr>
+        <w:pStyle w:val="TextBody"/>
+        <w:numPr>
+          <w:ilvl w:val="0"/>
+          <w:numId w:val="21"/>
+        </w:numPr>
+        <w:tabs>
+          <w:tab w:val="clear" w:pos="708"/>
+          <w:tab w:val="left" w:pos="0" w:leader="none"/>
+        </w:tabs>
+        <w:ind w:left="709" w:hanging="283"/>
+        <w:rPr/>
+      </w:pPr>
+      <w:r>
+        <w:rPr>
+          <w:rStyle w:val="Variable"/>
+        </w:rPr>
+        <w:t>string</w:t>
+      </w:r>
+      <w:r>
+        <w:rPr/>
+        <w:t xml:space="preserve"> specifies the data type as a string, which can store text</w:t>
+      </w:r>
+    </w:p>
+    <w:p>
+      <w:pPr>
+        <w:pStyle w:val="TextBody"/>
+        <w:numPr>
+          <w:ilvl w:val="0"/>
+          <w:numId w:val="21"/>
+        </w:numPr>
+        <w:tabs>
+          <w:tab w:val="clear" w:pos="708"/>
+          <w:tab w:val="left" w:pos="0" w:leader="none"/>
+        </w:tabs>
+        <w:ind w:left="709" w:hanging="283"/>
+        <w:rPr/>
+      </w:pPr>
+      <w:r>
+        <w:rPr>
+          <w:rStyle w:val="Variable"/>
+        </w:rPr>
+        <w:t>=</w:t>
+      </w:r>
+      <w:r>
+        <w:rPr/>
+        <w:t xml:space="preserve"> is the assignment operator.</w:t>
+      </w:r>
+    </w:p>
+    <w:p>
+      <w:pPr>
+        <w:pStyle w:val="TextBody"/>
+        <w:numPr>
+          <w:ilvl w:val="0"/>
+          <w:numId w:val="21"/>
+        </w:numPr>
+        <w:tabs>
+          <w:tab w:val="clear" w:pos="708"/>
+          <w:tab w:val="left" w:pos="0" w:leader="none"/>
+        </w:tabs>
+        <w:ind w:left="709" w:hanging="283"/>
+        <w:rPr/>
+      </w:pPr>
+      <w:r>
+        <w:rPr>
+          <w:rStyle w:val="Variable"/>
+        </w:rPr>
+        <w:t>"Introduction to Programming"</w:t>
+      </w:r>
+      <w:r>
+        <w:rPr/>
+        <w:t xml:space="preserve"> is the string value assigned to courseName. The text is enclosed in double quotes to indicate it is a string.</w:t>
+      </w:r>
+    </w:p>
+    <w:p>
+      <w:pPr>
+        <w:pStyle w:val="Normal"/>
+        <w:rPr>
+          <w:lang w:val="en-US"/>
+        </w:rPr>
+      </w:pPr>
+      <w:r>
+        <w:rPr>
+          <w:lang w:val="en-US"/>
+        </w:rPr>
       </w:r>
     </w:p>
     <w:p>
@@ -4889,12 +6041,18 @@
         <w:pStyle w:val="Normal"/>
         <w:spacing w:before="0" w:after="160"/>
         <w:rPr>
-          <w:sz w:val="28"/>
-          <w:szCs w:val="28"/>
-        </w:rPr>
-      </w:pPr>
-      <w:r>
-        <w:rPr/>
+          <w:b/>
+          <w:b/>
+          <w:bCs/>
+          <w:lang w:val="en-US"/>
+        </w:rPr>
+      </w:pPr>
+      <w:r>
+        <w:rPr>
+          <w:b/>
+          <w:bCs/>
+          <w:lang w:val="en-US"/>
+        </w:rPr>
       </w:r>
     </w:p>
     <w:sectPr>
@@ -6732,6 +7890,965 @@
     </w:lvl>
   </w:abstractNum>
   <w:abstractNum w:abstractNumId="15">
+    <w:lvl w:ilvl="0">
+      <w:start w:val="1"/>
+      <w:numFmt w:val="bullet"/>
+      <w:lvlText w:val=""/>
+      <w:lvlJc w:val="left"/>
+      <w:pPr>
+        <w:tabs>
+          <w:tab w:val="num" w:pos="709"/>
+        </w:tabs>
+        <w:ind w:left="709" w:hanging="283"/>
+      </w:pPr>
+      <w:rPr>
+        <w:rFonts w:ascii="Symbol" w:hAnsi="Symbol" w:cs="Symbol" w:hint="default"/>
+      </w:rPr>
+    </w:lvl>
+    <w:lvl w:ilvl="1">
+      <w:start w:val="1"/>
+      <w:numFmt w:val="bullet"/>
+      <w:lvlText w:val=""/>
+      <w:lvlJc w:val="left"/>
+      <w:pPr>
+        <w:tabs>
+          <w:tab w:val="num" w:pos="1418"/>
+        </w:tabs>
+        <w:ind w:left="1418" w:hanging="283"/>
+      </w:pPr>
+      <w:rPr>
+        <w:rFonts w:ascii="Symbol" w:hAnsi="Symbol" w:cs="Symbol" w:hint="default"/>
+      </w:rPr>
+    </w:lvl>
+    <w:lvl w:ilvl="2">
+      <w:start w:val="1"/>
+      <w:numFmt w:val="bullet"/>
+      <w:lvlText w:val=""/>
+      <w:lvlJc w:val="left"/>
+      <w:pPr>
+        <w:tabs>
+          <w:tab w:val="num" w:pos="2127"/>
+        </w:tabs>
+        <w:ind w:left="2127" w:hanging="283"/>
+      </w:pPr>
+      <w:rPr>
+        <w:rFonts w:ascii="Symbol" w:hAnsi="Symbol" w:cs="Symbol" w:hint="default"/>
+      </w:rPr>
+    </w:lvl>
+    <w:lvl w:ilvl="3">
+      <w:start w:val="1"/>
+      <w:numFmt w:val="bullet"/>
+      <w:lvlText w:val=""/>
+      <w:lvlJc w:val="left"/>
+      <w:pPr>
+        <w:tabs>
+          <w:tab w:val="num" w:pos="2836"/>
+        </w:tabs>
+        <w:ind w:left="2836" w:hanging="283"/>
+      </w:pPr>
+      <w:rPr>
+        <w:rFonts w:ascii="Symbol" w:hAnsi="Symbol" w:cs="Symbol" w:hint="default"/>
+      </w:rPr>
+    </w:lvl>
+    <w:lvl w:ilvl="4">
+      <w:start w:val="1"/>
+      <w:numFmt w:val="bullet"/>
+      <w:lvlText w:val=""/>
+      <w:lvlJc w:val="left"/>
+      <w:pPr>
+        <w:tabs>
+          <w:tab w:val="num" w:pos="3545"/>
+        </w:tabs>
+        <w:ind w:left="3545" w:hanging="283"/>
+      </w:pPr>
+      <w:rPr>
+        <w:rFonts w:ascii="Symbol" w:hAnsi="Symbol" w:cs="Symbol" w:hint="default"/>
+      </w:rPr>
+    </w:lvl>
+    <w:lvl w:ilvl="5">
+      <w:start w:val="1"/>
+      <w:numFmt w:val="bullet"/>
+      <w:lvlText w:val=""/>
+      <w:lvlJc w:val="left"/>
+      <w:pPr>
+        <w:tabs>
+          <w:tab w:val="num" w:pos="4254"/>
+        </w:tabs>
+        <w:ind w:left="4254" w:hanging="283"/>
+      </w:pPr>
+      <w:rPr>
+        <w:rFonts w:ascii="Symbol" w:hAnsi="Symbol" w:cs="Symbol" w:hint="default"/>
+      </w:rPr>
+    </w:lvl>
+    <w:lvl w:ilvl="6">
+      <w:start w:val="1"/>
+      <w:numFmt w:val="bullet"/>
+      <w:lvlText w:val=""/>
+      <w:lvlJc w:val="left"/>
+      <w:pPr>
+        <w:tabs>
+          <w:tab w:val="num" w:pos="4963"/>
+        </w:tabs>
+        <w:ind w:left="4963" w:hanging="283"/>
+      </w:pPr>
+      <w:rPr>
+        <w:rFonts w:ascii="Symbol" w:hAnsi="Symbol" w:cs="Symbol" w:hint="default"/>
+      </w:rPr>
+    </w:lvl>
+    <w:lvl w:ilvl="7">
+      <w:start w:val="1"/>
+      <w:numFmt w:val="bullet"/>
+      <w:lvlText w:val=""/>
+      <w:lvlJc w:val="left"/>
+      <w:pPr>
+        <w:tabs>
+          <w:tab w:val="num" w:pos="5672"/>
+        </w:tabs>
+        <w:ind w:left="5672" w:hanging="283"/>
+      </w:pPr>
+      <w:rPr>
+        <w:rFonts w:ascii="Symbol" w:hAnsi="Symbol" w:cs="Symbol" w:hint="default"/>
+      </w:rPr>
+    </w:lvl>
+    <w:lvl w:ilvl="8">
+      <w:start w:val="1"/>
+      <w:numFmt w:val="bullet"/>
+      <w:lvlText w:val=""/>
+      <w:lvlJc w:val="left"/>
+      <w:pPr>
+        <w:tabs>
+          <w:tab w:val="num" w:pos="6381"/>
+        </w:tabs>
+        <w:ind w:left="6381" w:hanging="283"/>
+      </w:pPr>
+      <w:rPr>
+        <w:rFonts w:ascii="Symbol" w:hAnsi="Symbol" w:cs="Symbol" w:hint="default"/>
+      </w:rPr>
+    </w:lvl>
+  </w:abstractNum>
+  <w:abstractNum w:abstractNumId="16">
+    <w:lvl w:ilvl="0">
+      <w:start w:val="1"/>
+      <w:numFmt w:val="bullet"/>
+      <w:lvlText w:val=""/>
+      <w:lvlJc w:val="left"/>
+      <w:pPr>
+        <w:tabs>
+          <w:tab w:val="num" w:pos="709"/>
+        </w:tabs>
+        <w:ind w:left="709" w:hanging="283"/>
+      </w:pPr>
+      <w:rPr>
+        <w:rFonts w:ascii="Symbol" w:hAnsi="Symbol" w:cs="Symbol" w:hint="default"/>
+      </w:rPr>
+    </w:lvl>
+    <w:lvl w:ilvl="1">
+      <w:start w:val="1"/>
+      <w:numFmt w:val="bullet"/>
+      <w:lvlText w:val=""/>
+      <w:lvlJc w:val="left"/>
+      <w:pPr>
+        <w:tabs>
+          <w:tab w:val="num" w:pos="1418"/>
+        </w:tabs>
+        <w:ind w:left="1418" w:hanging="283"/>
+      </w:pPr>
+      <w:rPr>
+        <w:rFonts w:ascii="Symbol" w:hAnsi="Symbol" w:cs="Symbol" w:hint="default"/>
+      </w:rPr>
+    </w:lvl>
+    <w:lvl w:ilvl="2">
+      <w:start w:val="1"/>
+      <w:numFmt w:val="bullet"/>
+      <w:lvlText w:val=""/>
+      <w:lvlJc w:val="left"/>
+      <w:pPr>
+        <w:tabs>
+          <w:tab w:val="num" w:pos="2127"/>
+        </w:tabs>
+        <w:ind w:left="2127" w:hanging="283"/>
+      </w:pPr>
+      <w:rPr>
+        <w:rFonts w:ascii="Symbol" w:hAnsi="Symbol" w:cs="Symbol" w:hint="default"/>
+      </w:rPr>
+    </w:lvl>
+    <w:lvl w:ilvl="3">
+      <w:start w:val="1"/>
+      <w:numFmt w:val="bullet"/>
+      <w:lvlText w:val=""/>
+      <w:lvlJc w:val="left"/>
+      <w:pPr>
+        <w:tabs>
+          <w:tab w:val="num" w:pos="2836"/>
+        </w:tabs>
+        <w:ind w:left="2836" w:hanging="283"/>
+      </w:pPr>
+      <w:rPr>
+        <w:rFonts w:ascii="Symbol" w:hAnsi="Symbol" w:cs="Symbol" w:hint="default"/>
+      </w:rPr>
+    </w:lvl>
+    <w:lvl w:ilvl="4">
+      <w:start w:val="1"/>
+      <w:numFmt w:val="bullet"/>
+      <w:lvlText w:val=""/>
+      <w:lvlJc w:val="left"/>
+      <w:pPr>
+        <w:tabs>
+          <w:tab w:val="num" w:pos="3545"/>
+        </w:tabs>
+        <w:ind w:left="3545" w:hanging="283"/>
+      </w:pPr>
+      <w:rPr>
+        <w:rFonts w:ascii="Symbol" w:hAnsi="Symbol" w:cs="Symbol" w:hint="default"/>
+      </w:rPr>
+    </w:lvl>
+    <w:lvl w:ilvl="5">
+      <w:start w:val="1"/>
+      <w:numFmt w:val="bullet"/>
+      <w:lvlText w:val=""/>
+      <w:lvlJc w:val="left"/>
+      <w:pPr>
+        <w:tabs>
+          <w:tab w:val="num" w:pos="4254"/>
+        </w:tabs>
+        <w:ind w:left="4254" w:hanging="283"/>
+      </w:pPr>
+      <w:rPr>
+        <w:rFonts w:ascii="Symbol" w:hAnsi="Symbol" w:cs="Symbol" w:hint="default"/>
+      </w:rPr>
+    </w:lvl>
+    <w:lvl w:ilvl="6">
+      <w:start w:val="1"/>
+      <w:numFmt w:val="bullet"/>
+      <w:lvlText w:val=""/>
+      <w:lvlJc w:val="left"/>
+      <w:pPr>
+        <w:tabs>
+          <w:tab w:val="num" w:pos="4963"/>
+        </w:tabs>
+        <w:ind w:left="4963" w:hanging="283"/>
+      </w:pPr>
+      <w:rPr>
+        <w:rFonts w:ascii="Symbol" w:hAnsi="Symbol" w:cs="Symbol" w:hint="default"/>
+      </w:rPr>
+    </w:lvl>
+    <w:lvl w:ilvl="7">
+      <w:start w:val="1"/>
+      <w:numFmt w:val="bullet"/>
+      <w:lvlText w:val=""/>
+      <w:lvlJc w:val="left"/>
+      <w:pPr>
+        <w:tabs>
+          <w:tab w:val="num" w:pos="5672"/>
+        </w:tabs>
+        <w:ind w:left="5672" w:hanging="283"/>
+      </w:pPr>
+      <w:rPr>
+        <w:rFonts w:ascii="Symbol" w:hAnsi="Symbol" w:cs="Symbol" w:hint="default"/>
+      </w:rPr>
+    </w:lvl>
+    <w:lvl w:ilvl="8">
+      <w:start w:val="1"/>
+      <w:numFmt w:val="bullet"/>
+      <w:lvlText w:val=""/>
+      <w:lvlJc w:val="left"/>
+      <w:pPr>
+        <w:tabs>
+          <w:tab w:val="num" w:pos="6381"/>
+        </w:tabs>
+        <w:ind w:left="6381" w:hanging="283"/>
+      </w:pPr>
+      <w:rPr>
+        <w:rFonts w:ascii="Symbol" w:hAnsi="Symbol" w:cs="Symbol" w:hint="default"/>
+      </w:rPr>
+    </w:lvl>
+  </w:abstractNum>
+  <w:abstractNum w:abstractNumId="17">
+    <w:lvl w:ilvl="0">
+      <w:start w:val="1"/>
+      <w:numFmt w:val="bullet"/>
+      <w:lvlText w:val=""/>
+      <w:lvlJc w:val="left"/>
+      <w:pPr>
+        <w:tabs>
+          <w:tab w:val="num" w:pos="709"/>
+        </w:tabs>
+        <w:ind w:left="709" w:hanging="283"/>
+      </w:pPr>
+      <w:rPr>
+        <w:rFonts w:ascii="Symbol" w:hAnsi="Symbol" w:cs="Symbol" w:hint="default"/>
+      </w:rPr>
+    </w:lvl>
+    <w:lvl w:ilvl="1">
+      <w:start w:val="1"/>
+      <w:numFmt w:val="bullet"/>
+      <w:lvlText w:val=""/>
+      <w:lvlJc w:val="left"/>
+      <w:pPr>
+        <w:tabs>
+          <w:tab w:val="num" w:pos="1418"/>
+        </w:tabs>
+        <w:ind w:left="1418" w:hanging="283"/>
+      </w:pPr>
+      <w:rPr>
+        <w:rFonts w:ascii="Symbol" w:hAnsi="Symbol" w:cs="Symbol" w:hint="default"/>
+      </w:rPr>
+    </w:lvl>
+    <w:lvl w:ilvl="2">
+      <w:start w:val="1"/>
+      <w:numFmt w:val="bullet"/>
+      <w:lvlText w:val=""/>
+      <w:lvlJc w:val="left"/>
+      <w:pPr>
+        <w:tabs>
+          <w:tab w:val="num" w:pos="2127"/>
+        </w:tabs>
+        <w:ind w:left="2127" w:hanging="283"/>
+      </w:pPr>
+      <w:rPr>
+        <w:rFonts w:ascii="Symbol" w:hAnsi="Symbol" w:cs="Symbol" w:hint="default"/>
+      </w:rPr>
+    </w:lvl>
+    <w:lvl w:ilvl="3">
+      <w:start w:val="1"/>
+      <w:numFmt w:val="bullet"/>
+      <w:lvlText w:val=""/>
+      <w:lvlJc w:val="left"/>
+      <w:pPr>
+        <w:tabs>
+          <w:tab w:val="num" w:pos="2836"/>
+        </w:tabs>
+        <w:ind w:left="2836" w:hanging="283"/>
+      </w:pPr>
+      <w:rPr>
+        <w:rFonts w:ascii="Symbol" w:hAnsi="Symbol" w:cs="Symbol" w:hint="default"/>
+      </w:rPr>
+    </w:lvl>
+    <w:lvl w:ilvl="4">
+      <w:start w:val="1"/>
+      <w:numFmt w:val="bullet"/>
+      <w:lvlText w:val=""/>
+      <w:lvlJc w:val="left"/>
+      <w:pPr>
+        <w:tabs>
+          <w:tab w:val="num" w:pos="3545"/>
+        </w:tabs>
+        <w:ind w:left="3545" w:hanging="283"/>
+      </w:pPr>
+      <w:rPr>
+        <w:rFonts w:ascii="Symbol" w:hAnsi="Symbol" w:cs="Symbol" w:hint="default"/>
+      </w:rPr>
+    </w:lvl>
+    <w:lvl w:ilvl="5">
+      <w:start w:val="1"/>
+      <w:numFmt w:val="bullet"/>
+      <w:lvlText w:val=""/>
+      <w:lvlJc w:val="left"/>
+      <w:pPr>
+        <w:tabs>
+          <w:tab w:val="num" w:pos="4254"/>
+        </w:tabs>
+        <w:ind w:left="4254" w:hanging="283"/>
+      </w:pPr>
+      <w:rPr>
+        <w:rFonts w:ascii="Symbol" w:hAnsi="Symbol" w:cs="Symbol" w:hint="default"/>
+      </w:rPr>
+    </w:lvl>
+    <w:lvl w:ilvl="6">
+      <w:start w:val="1"/>
+      <w:numFmt w:val="bullet"/>
+      <w:lvlText w:val=""/>
+      <w:lvlJc w:val="left"/>
+      <w:pPr>
+        <w:tabs>
+          <w:tab w:val="num" w:pos="4963"/>
+        </w:tabs>
+        <w:ind w:left="4963" w:hanging="283"/>
+      </w:pPr>
+      <w:rPr>
+        <w:rFonts w:ascii="Symbol" w:hAnsi="Symbol" w:cs="Symbol" w:hint="default"/>
+      </w:rPr>
+    </w:lvl>
+    <w:lvl w:ilvl="7">
+      <w:start w:val="1"/>
+      <w:numFmt w:val="bullet"/>
+      <w:lvlText w:val=""/>
+      <w:lvlJc w:val="left"/>
+      <w:pPr>
+        <w:tabs>
+          <w:tab w:val="num" w:pos="5672"/>
+        </w:tabs>
+        <w:ind w:left="5672" w:hanging="283"/>
+      </w:pPr>
+      <w:rPr>
+        <w:rFonts w:ascii="Symbol" w:hAnsi="Symbol" w:cs="Symbol" w:hint="default"/>
+      </w:rPr>
+    </w:lvl>
+    <w:lvl w:ilvl="8">
+      <w:start w:val="1"/>
+      <w:numFmt w:val="bullet"/>
+      <w:lvlText w:val=""/>
+      <w:lvlJc w:val="left"/>
+      <w:pPr>
+        <w:tabs>
+          <w:tab w:val="num" w:pos="6381"/>
+        </w:tabs>
+        <w:ind w:left="6381" w:hanging="283"/>
+      </w:pPr>
+      <w:rPr>
+        <w:rFonts w:ascii="Symbol" w:hAnsi="Symbol" w:cs="Symbol" w:hint="default"/>
+      </w:rPr>
+    </w:lvl>
+  </w:abstractNum>
+  <w:abstractNum w:abstractNumId="18">
+    <w:lvl w:ilvl="0">
+      <w:start w:val="1"/>
+      <w:numFmt w:val="bullet"/>
+      <w:lvlText w:val=""/>
+      <w:lvlJc w:val="left"/>
+      <w:pPr>
+        <w:tabs>
+          <w:tab w:val="num" w:pos="709"/>
+        </w:tabs>
+        <w:ind w:left="709" w:hanging="283"/>
+      </w:pPr>
+      <w:rPr>
+        <w:rFonts w:ascii="Symbol" w:hAnsi="Symbol" w:cs="Symbol" w:hint="default"/>
+      </w:rPr>
+    </w:lvl>
+    <w:lvl w:ilvl="1">
+      <w:start w:val="1"/>
+      <w:numFmt w:val="bullet"/>
+      <w:lvlText w:val=""/>
+      <w:lvlJc w:val="left"/>
+      <w:pPr>
+        <w:tabs>
+          <w:tab w:val="num" w:pos="1418"/>
+        </w:tabs>
+        <w:ind w:left="1418" w:hanging="283"/>
+      </w:pPr>
+      <w:rPr>
+        <w:rFonts w:ascii="Symbol" w:hAnsi="Symbol" w:cs="Symbol" w:hint="default"/>
+      </w:rPr>
+    </w:lvl>
+    <w:lvl w:ilvl="2">
+      <w:start w:val="1"/>
+      <w:numFmt w:val="bullet"/>
+      <w:lvlText w:val=""/>
+      <w:lvlJc w:val="left"/>
+      <w:pPr>
+        <w:tabs>
+          <w:tab w:val="num" w:pos="2127"/>
+        </w:tabs>
+        <w:ind w:left="2127" w:hanging="283"/>
+      </w:pPr>
+      <w:rPr>
+        <w:rFonts w:ascii="Symbol" w:hAnsi="Symbol" w:cs="Symbol" w:hint="default"/>
+      </w:rPr>
+    </w:lvl>
+    <w:lvl w:ilvl="3">
+      <w:start w:val="1"/>
+      <w:numFmt w:val="bullet"/>
+      <w:lvlText w:val=""/>
+      <w:lvlJc w:val="left"/>
+      <w:pPr>
+        <w:tabs>
+          <w:tab w:val="num" w:pos="2836"/>
+        </w:tabs>
+        <w:ind w:left="2836" w:hanging="283"/>
+      </w:pPr>
+      <w:rPr>
+        <w:rFonts w:ascii="Symbol" w:hAnsi="Symbol" w:cs="Symbol" w:hint="default"/>
+      </w:rPr>
+    </w:lvl>
+    <w:lvl w:ilvl="4">
+      <w:start w:val="1"/>
+      <w:numFmt w:val="bullet"/>
+      <w:lvlText w:val=""/>
+      <w:lvlJc w:val="left"/>
+      <w:pPr>
+        <w:tabs>
+          <w:tab w:val="num" w:pos="3545"/>
+        </w:tabs>
+        <w:ind w:left="3545" w:hanging="283"/>
+      </w:pPr>
+      <w:rPr>
+        <w:rFonts w:ascii="Symbol" w:hAnsi="Symbol" w:cs="Symbol" w:hint="default"/>
+      </w:rPr>
+    </w:lvl>
+    <w:lvl w:ilvl="5">
+      <w:start w:val="1"/>
+      <w:numFmt w:val="bullet"/>
+      <w:lvlText w:val=""/>
+      <w:lvlJc w:val="left"/>
+      <w:pPr>
+        <w:tabs>
+          <w:tab w:val="num" w:pos="4254"/>
+        </w:tabs>
+        <w:ind w:left="4254" w:hanging="283"/>
+      </w:pPr>
+      <w:rPr>
+        <w:rFonts w:ascii="Symbol" w:hAnsi="Symbol" w:cs="Symbol" w:hint="default"/>
+      </w:rPr>
+    </w:lvl>
+    <w:lvl w:ilvl="6">
+      <w:start w:val="1"/>
+      <w:numFmt w:val="bullet"/>
+      <w:lvlText w:val=""/>
+      <w:lvlJc w:val="left"/>
+      <w:pPr>
+        <w:tabs>
+          <w:tab w:val="num" w:pos="4963"/>
+        </w:tabs>
+        <w:ind w:left="4963" w:hanging="283"/>
+      </w:pPr>
+      <w:rPr>
+        <w:rFonts w:ascii="Symbol" w:hAnsi="Symbol" w:cs="Symbol" w:hint="default"/>
+      </w:rPr>
+    </w:lvl>
+    <w:lvl w:ilvl="7">
+      <w:start w:val="1"/>
+      <w:numFmt w:val="bullet"/>
+      <w:lvlText w:val=""/>
+      <w:lvlJc w:val="left"/>
+      <w:pPr>
+        <w:tabs>
+          <w:tab w:val="num" w:pos="5672"/>
+        </w:tabs>
+        <w:ind w:left="5672" w:hanging="283"/>
+      </w:pPr>
+      <w:rPr>
+        <w:rFonts w:ascii="Symbol" w:hAnsi="Symbol" w:cs="Symbol" w:hint="default"/>
+      </w:rPr>
+    </w:lvl>
+    <w:lvl w:ilvl="8">
+      <w:start w:val="1"/>
+      <w:numFmt w:val="bullet"/>
+      <w:lvlText w:val=""/>
+      <w:lvlJc w:val="left"/>
+      <w:pPr>
+        <w:tabs>
+          <w:tab w:val="num" w:pos="6381"/>
+        </w:tabs>
+        <w:ind w:left="6381" w:hanging="283"/>
+      </w:pPr>
+      <w:rPr>
+        <w:rFonts w:ascii="Symbol" w:hAnsi="Symbol" w:cs="Symbol" w:hint="default"/>
+      </w:rPr>
+    </w:lvl>
+  </w:abstractNum>
+  <w:abstractNum w:abstractNumId="19">
+    <w:lvl w:ilvl="0">
+      <w:start w:val="1"/>
+      <w:numFmt w:val="bullet"/>
+      <w:lvlText w:val=""/>
+      <w:lvlJc w:val="left"/>
+      <w:pPr>
+        <w:tabs>
+          <w:tab w:val="num" w:pos="709"/>
+        </w:tabs>
+        <w:ind w:left="709" w:hanging="283"/>
+      </w:pPr>
+      <w:rPr>
+        <w:rFonts w:ascii="Symbol" w:hAnsi="Symbol" w:cs="Symbol" w:hint="default"/>
+      </w:rPr>
+    </w:lvl>
+    <w:lvl w:ilvl="1">
+      <w:start w:val="1"/>
+      <w:numFmt w:val="bullet"/>
+      <w:lvlText w:val=""/>
+      <w:lvlJc w:val="left"/>
+      <w:pPr>
+        <w:tabs>
+          <w:tab w:val="num" w:pos="1418"/>
+        </w:tabs>
+        <w:ind w:left="1418" w:hanging="283"/>
+      </w:pPr>
+      <w:rPr>
+        <w:rFonts w:ascii="Symbol" w:hAnsi="Symbol" w:cs="Symbol" w:hint="default"/>
+      </w:rPr>
+    </w:lvl>
+    <w:lvl w:ilvl="2">
+      <w:start w:val="1"/>
+      <w:numFmt w:val="bullet"/>
+      <w:lvlText w:val=""/>
+      <w:lvlJc w:val="left"/>
+      <w:pPr>
+        <w:tabs>
+          <w:tab w:val="num" w:pos="2127"/>
+        </w:tabs>
+        <w:ind w:left="2127" w:hanging="283"/>
+      </w:pPr>
+      <w:rPr>
+        <w:rFonts w:ascii="Symbol" w:hAnsi="Symbol" w:cs="Symbol" w:hint="default"/>
+      </w:rPr>
+    </w:lvl>
+    <w:lvl w:ilvl="3">
+      <w:start w:val="1"/>
+      <w:numFmt w:val="bullet"/>
+      <w:lvlText w:val=""/>
+      <w:lvlJc w:val="left"/>
+      <w:pPr>
+        <w:tabs>
+          <w:tab w:val="num" w:pos="2836"/>
+        </w:tabs>
+        <w:ind w:left="2836" w:hanging="283"/>
+      </w:pPr>
+      <w:rPr>
+        <w:rFonts w:ascii="Symbol" w:hAnsi="Symbol" w:cs="Symbol" w:hint="default"/>
+      </w:rPr>
+    </w:lvl>
+    <w:lvl w:ilvl="4">
+      <w:start w:val="1"/>
+      <w:numFmt w:val="bullet"/>
+      <w:lvlText w:val=""/>
+      <w:lvlJc w:val="left"/>
+      <w:pPr>
+        <w:tabs>
+          <w:tab w:val="num" w:pos="3545"/>
+        </w:tabs>
+        <w:ind w:left="3545" w:hanging="283"/>
+      </w:pPr>
+      <w:rPr>
+        <w:rFonts w:ascii="Symbol" w:hAnsi="Symbol" w:cs="Symbol" w:hint="default"/>
+      </w:rPr>
+    </w:lvl>
+    <w:lvl w:ilvl="5">
+      <w:start w:val="1"/>
+      <w:numFmt w:val="bullet"/>
+      <w:lvlText w:val=""/>
+      <w:lvlJc w:val="left"/>
+      <w:pPr>
+        <w:tabs>
+          <w:tab w:val="num" w:pos="4254"/>
+        </w:tabs>
+        <w:ind w:left="4254" w:hanging="283"/>
+      </w:pPr>
+      <w:rPr>
+        <w:rFonts w:ascii="Symbol" w:hAnsi="Symbol" w:cs="Symbol" w:hint="default"/>
+      </w:rPr>
+    </w:lvl>
+    <w:lvl w:ilvl="6">
+      <w:start w:val="1"/>
+      <w:numFmt w:val="bullet"/>
+      <w:lvlText w:val=""/>
+      <w:lvlJc w:val="left"/>
+      <w:pPr>
+        <w:tabs>
+          <w:tab w:val="num" w:pos="4963"/>
+        </w:tabs>
+        <w:ind w:left="4963" w:hanging="283"/>
+      </w:pPr>
+      <w:rPr>
+        <w:rFonts w:ascii="Symbol" w:hAnsi="Symbol" w:cs="Symbol" w:hint="default"/>
+      </w:rPr>
+    </w:lvl>
+    <w:lvl w:ilvl="7">
+      <w:start w:val="1"/>
+      <w:numFmt w:val="bullet"/>
+      <w:lvlText w:val=""/>
+      <w:lvlJc w:val="left"/>
+      <w:pPr>
+        <w:tabs>
+          <w:tab w:val="num" w:pos="5672"/>
+        </w:tabs>
+        <w:ind w:left="5672" w:hanging="283"/>
+      </w:pPr>
+      <w:rPr>
+        <w:rFonts w:ascii="Symbol" w:hAnsi="Symbol" w:cs="Symbol" w:hint="default"/>
+      </w:rPr>
+    </w:lvl>
+    <w:lvl w:ilvl="8">
+      <w:start w:val="1"/>
+      <w:numFmt w:val="bullet"/>
+      <w:lvlText w:val=""/>
+      <w:lvlJc w:val="left"/>
+      <w:pPr>
+        <w:tabs>
+          <w:tab w:val="num" w:pos="6381"/>
+        </w:tabs>
+        <w:ind w:left="6381" w:hanging="283"/>
+      </w:pPr>
+      <w:rPr>
+        <w:rFonts w:ascii="Symbol" w:hAnsi="Symbol" w:cs="Symbol" w:hint="default"/>
+      </w:rPr>
+    </w:lvl>
+  </w:abstractNum>
+  <w:abstractNum w:abstractNumId="20">
+    <w:lvl w:ilvl="0">
+      <w:start w:val="1"/>
+      <w:numFmt w:val="bullet"/>
+      <w:lvlText w:val=""/>
+      <w:lvlJc w:val="left"/>
+      <w:pPr>
+        <w:tabs>
+          <w:tab w:val="num" w:pos="709"/>
+        </w:tabs>
+        <w:ind w:left="709" w:hanging="283"/>
+      </w:pPr>
+      <w:rPr>
+        <w:rFonts w:ascii="Symbol" w:hAnsi="Symbol" w:cs="Symbol" w:hint="default"/>
+      </w:rPr>
+    </w:lvl>
+    <w:lvl w:ilvl="1">
+      <w:start w:val="1"/>
+      <w:numFmt w:val="bullet"/>
+      <w:lvlText w:val=""/>
+      <w:lvlJc w:val="left"/>
+      <w:pPr>
+        <w:tabs>
+          <w:tab w:val="num" w:pos="1418"/>
+        </w:tabs>
+        <w:ind w:left="1418" w:hanging="283"/>
+      </w:pPr>
+      <w:rPr>
+        <w:rFonts w:ascii="Symbol" w:hAnsi="Symbol" w:cs="Symbol" w:hint="default"/>
+      </w:rPr>
+    </w:lvl>
+    <w:lvl w:ilvl="2">
+      <w:start w:val="1"/>
+      <w:numFmt w:val="bullet"/>
+      <w:lvlText w:val=""/>
+      <w:lvlJc w:val="left"/>
+      <w:pPr>
+        <w:tabs>
+          <w:tab w:val="num" w:pos="2127"/>
+        </w:tabs>
+        <w:ind w:left="2127" w:hanging="283"/>
+      </w:pPr>
+      <w:rPr>
+        <w:rFonts w:ascii="Symbol" w:hAnsi="Symbol" w:cs="Symbol" w:hint="default"/>
+      </w:rPr>
+    </w:lvl>
+    <w:lvl w:ilvl="3">
+      <w:start w:val="1"/>
+      <w:numFmt w:val="bullet"/>
+      <w:lvlText w:val=""/>
+      <w:lvlJc w:val="left"/>
+      <w:pPr>
+        <w:tabs>
+          <w:tab w:val="num" w:pos="2836"/>
+        </w:tabs>
+        <w:ind w:left="2836" w:hanging="283"/>
+      </w:pPr>
+      <w:rPr>
+        <w:rFonts w:ascii="Symbol" w:hAnsi="Symbol" w:cs="Symbol" w:hint="default"/>
+      </w:rPr>
+    </w:lvl>
+    <w:lvl w:ilvl="4">
+      <w:start w:val="1"/>
+      <w:numFmt w:val="bullet"/>
+      <w:lvlText w:val=""/>
+      <w:lvlJc w:val="left"/>
+      <w:pPr>
+        <w:tabs>
+          <w:tab w:val="num" w:pos="3545"/>
+        </w:tabs>
+        <w:ind w:left="3545" w:hanging="283"/>
+      </w:pPr>
+      <w:rPr>
+        <w:rFonts w:ascii="Symbol" w:hAnsi="Symbol" w:cs="Symbol" w:hint="default"/>
+      </w:rPr>
+    </w:lvl>
+    <w:lvl w:ilvl="5">
+      <w:start w:val="1"/>
+      <w:numFmt w:val="bullet"/>
+      <w:lvlText w:val=""/>
+      <w:lvlJc w:val="left"/>
+      <w:pPr>
+        <w:tabs>
+          <w:tab w:val="num" w:pos="4254"/>
+        </w:tabs>
+        <w:ind w:left="4254" w:hanging="283"/>
+      </w:pPr>
+      <w:rPr>
+        <w:rFonts w:ascii="Symbol" w:hAnsi="Symbol" w:cs="Symbol" w:hint="default"/>
+      </w:rPr>
+    </w:lvl>
+    <w:lvl w:ilvl="6">
+      <w:start w:val="1"/>
+      <w:numFmt w:val="bullet"/>
+      <w:lvlText w:val=""/>
+      <w:lvlJc w:val="left"/>
+      <w:pPr>
+        <w:tabs>
+          <w:tab w:val="num" w:pos="4963"/>
+        </w:tabs>
+        <w:ind w:left="4963" w:hanging="283"/>
+      </w:pPr>
+      <w:rPr>
+        <w:rFonts w:ascii="Symbol" w:hAnsi="Symbol" w:cs="Symbol" w:hint="default"/>
+      </w:rPr>
+    </w:lvl>
+    <w:lvl w:ilvl="7">
+      <w:start w:val="1"/>
+      <w:numFmt w:val="bullet"/>
+      <w:lvlText w:val=""/>
+      <w:lvlJc w:val="left"/>
+      <w:pPr>
+        <w:tabs>
+          <w:tab w:val="num" w:pos="5672"/>
+        </w:tabs>
+        <w:ind w:left="5672" w:hanging="283"/>
+      </w:pPr>
+      <w:rPr>
+        <w:rFonts w:ascii="Symbol" w:hAnsi="Symbol" w:cs="Symbol" w:hint="default"/>
+      </w:rPr>
+    </w:lvl>
+    <w:lvl w:ilvl="8">
+      <w:start w:val="1"/>
+      <w:numFmt w:val="bullet"/>
+      <w:lvlText w:val=""/>
+      <w:lvlJc w:val="left"/>
+      <w:pPr>
+        <w:tabs>
+          <w:tab w:val="num" w:pos="6381"/>
+        </w:tabs>
+        <w:ind w:left="6381" w:hanging="283"/>
+      </w:pPr>
+      <w:rPr>
+        <w:rFonts w:ascii="Symbol" w:hAnsi="Symbol" w:cs="Symbol" w:hint="default"/>
+      </w:rPr>
+    </w:lvl>
+  </w:abstractNum>
+  <w:abstractNum w:abstractNumId="21">
+    <w:lvl w:ilvl="0">
+      <w:start w:val="1"/>
+      <w:numFmt w:val="bullet"/>
+      <w:lvlText w:val=""/>
+      <w:lvlJc w:val="left"/>
+      <w:pPr>
+        <w:tabs>
+          <w:tab w:val="num" w:pos="709"/>
+        </w:tabs>
+        <w:ind w:left="709" w:hanging="283"/>
+      </w:pPr>
+      <w:rPr>
+        <w:rFonts w:ascii="Symbol" w:hAnsi="Symbol" w:cs="Symbol" w:hint="default"/>
+      </w:rPr>
+    </w:lvl>
+    <w:lvl w:ilvl="1">
+      <w:start w:val="1"/>
+      <w:numFmt w:val="bullet"/>
+      <w:lvlText w:val=""/>
+      <w:lvlJc w:val="left"/>
+      <w:pPr>
+        <w:tabs>
+          <w:tab w:val="num" w:pos="1418"/>
+        </w:tabs>
+        <w:ind w:left="1418" w:hanging="283"/>
+      </w:pPr>
+      <w:rPr>
+        <w:rFonts w:ascii="Symbol" w:hAnsi="Symbol" w:cs="Symbol" w:hint="default"/>
+      </w:rPr>
+    </w:lvl>
+    <w:lvl w:ilvl="2">
+      <w:start w:val="1"/>
+      <w:numFmt w:val="bullet"/>
+      <w:lvlText w:val=""/>
+      <w:lvlJc w:val="left"/>
+      <w:pPr>
+        <w:tabs>
+          <w:tab w:val="num" w:pos="2127"/>
+        </w:tabs>
+        <w:ind w:left="2127" w:hanging="283"/>
+      </w:pPr>
+      <w:rPr>
+        <w:rFonts w:ascii="Symbol" w:hAnsi="Symbol" w:cs="Symbol" w:hint="default"/>
+      </w:rPr>
+    </w:lvl>
+    <w:lvl w:ilvl="3">
+      <w:start w:val="1"/>
+      <w:numFmt w:val="bullet"/>
+      <w:lvlText w:val=""/>
+      <w:lvlJc w:val="left"/>
+      <w:pPr>
+        <w:tabs>
+          <w:tab w:val="num" w:pos="2836"/>
+        </w:tabs>
+        <w:ind w:left="2836" w:hanging="283"/>
+      </w:pPr>
+      <w:rPr>
+        <w:rFonts w:ascii="Symbol" w:hAnsi="Symbol" w:cs="Symbol" w:hint="default"/>
+      </w:rPr>
+    </w:lvl>
+    <w:lvl w:ilvl="4">
+      <w:start w:val="1"/>
+      <w:numFmt w:val="bullet"/>
+      <w:lvlText w:val=""/>
+      <w:lvlJc w:val="left"/>
+      <w:pPr>
+        <w:tabs>
+          <w:tab w:val="num" w:pos="3545"/>
+        </w:tabs>
+        <w:ind w:left="3545" w:hanging="283"/>
+      </w:pPr>
+      <w:rPr>
+        <w:rFonts w:ascii="Symbol" w:hAnsi="Symbol" w:cs="Symbol" w:hint="default"/>
+      </w:rPr>
+    </w:lvl>
+    <w:lvl w:ilvl="5">
+      <w:start w:val="1"/>
+      <w:numFmt w:val="bullet"/>
+      <w:lvlText w:val=""/>
+      <w:lvlJc w:val="left"/>
+      <w:pPr>
+        <w:tabs>
+          <w:tab w:val="num" w:pos="4254"/>
+        </w:tabs>
+        <w:ind w:left="4254" w:hanging="283"/>
+      </w:pPr>
+      <w:rPr>
+        <w:rFonts w:ascii="Symbol" w:hAnsi="Symbol" w:cs="Symbol" w:hint="default"/>
+      </w:rPr>
+    </w:lvl>
+    <w:lvl w:ilvl="6">
+      <w:start w:val="1"/>
+      <w:numFmt w:val="bullet"/>
+      <w:lvlText w:val=""/>
+      <w:lvlJc w:val="left"/>
+      <w:pPr>
+        <w:tabs>
+          <w:tab w:val="num" w:pos="4963"/>
+        </w:tabs>
+        <w:ind w:left="4963" w:hanging="283"/>
+      </w:pPr>
+      <w:rPr>
+        <w:rFonts w:ascii="Symbol" w:hAnsi="Symbol" w:cs="Symbol" w:hint="default"/>
+      </w:rPr>
+    </w:lvl>
+    <w:lvl w:ilvl="7">
+      <w:start w:val="1"/>
+      <w:numFmt w:val="bullet"/>
+      <w:lvlText w:val=""/>
+      <w:lvlJc w:val="left"/>
+      <w:pPr>
+        <w:tabs>
+          <w:tab w:val="num" w:pos="5672"/>
+        </w:tabs>
+        <w:ind w:left="5672" w:hanging="283"/>
+      </w:pPr>
+      <w:rPr>
+        <w:rFonts w:ascii="Symbol" w:hAnsi="Symbol" w:cs="Symbol" w:hint="default"/>
+      </w:rPr>
+    </w:lvl>
+    <w:lvl w:ilvl="8">
+      <w:start w:val="1"/>
+      <w:numFmt w:val="bullet"/>
+      <w:lvlText w:val=""/>
+      <w:lvlJc w:val="left"/>
+      <w:pPr>
+        <w:tabs>
+          <w:tab w:val="num" w:pos="6381"/>
+        </w:tabs>
+        <w:ind w:left="6381" w:hanging="283"/>
+      </w:pPr>
+      <w:rPr>
+        <w:rFonts w:ascii="Symbol" w:hAnsi="Symbol" w:cs="Symbol" w:hint="default"/>
+      </w:rPr>
+    </w:lvl>
+  </w:abstractNum>
+  <w:abstractNum w:abstractNumId="22">
     <w:lvl w:ilvl="0">
       <w:start w:val="1"/>
       <w:numFmt w:val="none"/>
@@ -6894,6 +9011,27 @@
   </w:num>
   <w:num w:numId="15">
     <w:abstractNumId w:val="15"/>
+  </w:num>
+  <w:num w:numId="16">
+    <w:abstractNumId w:val="16"/>
+  </w:num>
+  <w:num w:numId="17">
+    <w:abstractNumId w:val="17"/>
+  </w:num>
+  <w:num w:numId="18">
+    <w:abstractNumId w:val="18"/>
+  </w:num>
+  <w:num w:numId="19">
+    <w:abstractNumId w:val="19"/>
+  </w:num>
+  <w:num w:numId="20">
+    <w:abstractNumId w:val="20"/>
+  </w:num>
+  <w:num w:numId="21">
+    <w:abstractNumId w:val="21"/>
+  </w:num>
+  <w:num w:numId="22">
+    <w:abstractNumId w:val="22"/>
   </w:num>
 </w:numbering>
 </file>

</xml_diff>

<commit_message>
add lectures and activities
</commit_message>
<xml_diff>
--- a/Microsoft Full stack course/1. Foundations of coding full stack/3. Algorithms, flow charts and data types/Algorithms, flow charts and data types.docx
+++ b/Microsoft Full stack course/1. Foundations of coding full stack/3. Algorithms, flow charts and data types/Algorithms, flow charts and data types.docx
@@ -24,27 +24,1442 @@
         </w:rPr>
         <w:t>Algorithms, flowcharts and data type</w:t>
       </w:r>
-    </w:p>
-    <w:p>
-      <w:pPr>
-        <w:pStyle w:val="Normal"/>
-        <w:rPr>
-          <w:b/>
+      <w:r>
+        <w:rPr>
           <w:b/>
           <w:bCs/>
-          <w:sz w:val="28"/>
-          <w:szCs w:val="28"/>
-          <w:lang w:val="en-US"/>
-        </w:rPr>
-      </w:pPr>
-      <w:r>
-        <w:rPr>
-          <w:b/>
-          <w:bCs/>
-          <w:sz w:val="28"/>
-          <w:szCs w:val="28"/>
-          <w:lang w:val="en-US"/>
-        </w:rPr>
+          <w:sz w:val="32"/>
+          <w:szCs w:val="32"/>
+          <w:lang w:val="en-US"/>
+        </w:rPr>
+        <w:t>s</w:t>
+      </w:r>
+    </w:p>
+    <w:p>
+      <w:pPr>
+        <w:pStyle w:val="Normal"/>
+        <w:rPr>
+          <w:b w:val="false"/>
+          <w:b w:val="false"/>
+          <w:bCs w:val="false"/>
+        </w:rPr>
+      </w:pPr>
+      <w:r>
+        <w:rPr>
+          <w:b w:val="false"/>
+          <w:bCs w:val="false"/>
+        </w:rPr>
+        <w:t>Table of Contents</w:t>
+      </w:r>
+    </w:p>
+    <w:p>
+      <w:pPr>
+        <w:pStyle w:val="Normal"/>
+        <w:rPr>
+          <w:b w:val="false"/>
+          <w:b w:val="false"/>
+          <w:bCs w:val="false"/>
+        </w:rPr>
+      </w:pPr>
+      <w:r>
+        <w:rPr>
+          <w:b w:val="false"/>
+          <w:bCs w:val="false"/>
+        </w:rPr>
+      </w:r>
+    </w:p>
+    <w:p>
+      <w:pPr>
+        <w:pStyle w:val="Normal"/>
+        <w:rPr>
+          <w:b w:val="false"/>
+          <w:b w:val="false"/>
+          <w:bCs w:val="false"/>
+        </w:rPr>
+      </w:pPr>
+      <w:r>
+        <w:rPr>
+          <w:b w:val="false"/>
+          <w:bCs w:val="false"/>
+        </w:rPr>
+        <w:t>1. Algorithms, Flowcharts, and Data Types</w:t>
+      </w:r>
+    </w:p>
+    <w:p>
+      <w:pPr>
+        <w:pStyle w:val="Normal"/>
+        <w:rPr>
+          <w:b w:val="false"/>
+          <w:b w:val="false"/>
+          <w:bCs w:val="false"/>
+        </w:rPr>
+      </w:pPr>
+      <w:r>
+        <w:rPr>
+          <w:b w:val="false"/>
+          <w:bCs w:val="false"/>
+        </w:rPr>
+      </w:r>
+    </w:p>
+    <w:p>
+      <w:pPr>
+        <w:pStyle w:val="Normal"/>
+        <w:rPr>
+          <w:b w:val="false"/>
+          <w:b w:val="false"/>
+          <w:bCs w:val="false"/>
+        </w:rPr>
+      </w:pPr>
+      <w:r>
+        <w:rPr>
+          <w:b w:val="false"/>
+          <w:bCs w:val="false"/>
+        </w:rPr>
+        <w:t>2. Introduction to Key Algorithm Structures</w:t>
+      </w:r>
+    </w:p>
+    <w:p>
+      <w:pPr>
+        <w:pStyle w:val="Normal"/>
+        <w:rPr>
+          <w:b w:val="false"/>
+          <w:b w:val="false"/>
+          <w:bCs w:val="false"/>
+        </w:rPr>
+      </w:pPr>
+      <w:r>
+        <w:rPr>
+          <w:b w:val="false"/>
+          <w:bCs w:val="false"/>
+        </w:rPr>
+        <w:t xml:space="preserve">   </w:t>
+      </w:r>
+      <w:r>
+        <w:rPr>
+          <w:b w:val="false"/>
+          <w:bCs w:val="false"/>
+        </w:rPr>
+        <w:t>2.1 Conditional Statements</w:t>
+      </w:r>
+    </w:p>
+    <w:p>
+      <w:pPr>
+        <w:pStyle w:val="Normal"/>
+        <w:rPr>
+          <w:b w:val="false"/>
+          <w:b w:val="false"/>
+          <w:bCs w:val="false"/>
+        </w:rPr>
+      </w:pPr>
+      <w:r>
+        <w:rPr>
+          <w:b w:val="false"/>
+          <w:bCs w:val="false"/>
+        </w:rPr>
+        <w:t xml:space="preserve">       </w:t>
+      </w:r>
+      <w:r>
+        <w:rPr>
+          <w:b w:val="false"/>
+          <w:bCs w:val="false"/>
+        </w:rPr>
+        <w:t>2.1.1 Types of Conditional Statements</w:t>
+      </w:r>
+    </w:p>
+    <w:p>
+      <w:pPr>
+        <w:pStyle w:val="Normal"/>
+        <w:rPr>
+          <w:b w:val="false"/>
+          <w:b w:val="false"/>
+          <w:bCs w:val="false"/>
+        </w:rPr>
+      </w:pPr>
+      <w:r>
+        <w:rPr>
+          <w:b w:val="false"/>
+          <w:bCs w:val="false"/>
+        </w:rPr>
+        <w:t xml:space="preserve">       </w:t>
+      </w:r>
+      <w:r>
+        <w:rPr>
+          <w:b w:val="false"/>
+          <w:bCs w:val="false"/>
+        </w:rPr>
+        <w:t>2.1.2 Example: Checking Voter Eligibility</w:t>
+      </w:r>
+    </w:p>
+    <w:p>
+      <w:pPr>
+        <w:pStyle w:val="Normal"/>
+        <w:rPr>
+          <w:b w:val="false"/>
+          <w:b w:val="false"/>
+          <w:bCs w:val="false"/>
+        </w:rPr>
+      </w:pPr>
+      <w:r>
+        <w:rPr>
+          <w:b w:val="false"/>
+          <w:bCs w:val="false"/>
+        </w:rPr>
+        <w:t xml:space="preserve">   </w:t>
+      </w:r>
+      <w:r>
+        <w:rPr>
+          <w:b w:val="false"/>
+          <w:bCs w:val="false"/>
+        </w:rPr>
+        <w:t>2.2 Categorical Statements</w:t>
+      </w:r>
+    </w:p>
+    <w:p>
+      <w:pPr>
+        <w:pStyle w:val="Normal"/>
+        <w:rPr>
+          <w:b w:val="false"/>
+          <w:b w:val="false"/>
+          <w:bCs w:val="false"/>
+        </w:rPr>
+      </w:pPr>
+      <w:r>
+        <w:rPr>
+          <w:b w:val="false"/>
+          <w:bCs w:val="false"/>
+        </w:rPr>
+        <w:t xml:space="preserve">       </w:t>
+      </w:r>
+      <w:r>
+        <w:rPr>
+          <w:b w:val="false"/>
+          <w:bCs w:val="false"/>
+        </w:rPr>
+        <w:t>2.2.1 Example: Grouping Event Attendees by Age</w:t>
+      </w:r>
+    </w:p>
+    <w:p>
+      <w:pPr>
+        <w:pStyle w:val="Normal"/>
+        <w:rPr>
+          <w:b w:val="false"/>
+          <w:b w:val="false"/>
+          <w:bCs w:val="false"/>
+        </w:rPr>
+      </w:pPr>
+      <w:r>
+        <w:rPr>
+          <w:b w:val="false"/>
+          <w:bCs w:val="false"/>
+        </w:rPr>
+        <w:t xml:space="preserve">   </w:t>
+      </w:r>
+      <w:r>
+        <w:rPr>
+          <w:b w:val="false"/>
+          <w:bCs w:val="false"/>
+        </w:rPr>
+        <w:t>2.3 Binary Structures</w:t>
+      </w:r>
+    </w:p>
+    <w:p>
+      <w:pPr>
+        <w:pStyle w:val="Normal"/>
+        <w:rPr>
+          <w:b w:val="false"/>
+          <w:b w:val="false"/>
+          <w:bCs w:val="false"/>
+        </w:rPr>
+      </w:pPr>
+      <w:r>
+        <w:rPr>
+          <w:b w:val="false"/>
+          <w:bCs w:val="false"/>
+        </w:rPr>
+        <w:t xml:space="preserve">       </w:t>
+      </w:r>
+      <w:r>
+        <w:rPr>
+          <w:b w:val="false"/>
+          <w:bCs w:val="false"/>
+        </w:rPr>
+        <w:t>2.3.1 Example: Categorizing Attendees for Age-Restricted Events</w:t>
+      </w:r>
+    </w:p>
+    <w:p>
+      <w:pPr>
+        <w:pStyle w:val="Normal"/>
+        <w:rPr>
+          <w:b w:val="false"/>
+          <w:b w:val="false"/>
+          <w:bCs w:val="false"/>
+        </w:rPr>
+      </w:pPr>
+      <w:r>
+        <w:rPr>
+          <w:b w:val="false"/>
+          <w:bCs w:val="false"/>
+        </w:rPr>
+      </w:r>
+    </w:p>
+    <w:p>
+      <w:pPr>
+        <w:pStyle w:val="Normal"/>
+        <w:rPr>
+          <w:b w:val="false"/>
+          <w:b w:val="false"/>
+          <w:bCs w:val="false"/>
+        </w:rPr>
+      </w:pPr>
+      <w:r>
+        <w:rPr>
+          <w:b w:val="false"/>
+          <w:bCs w:val="false"/>
+        </w:rPr>
+        <w:t>3. Activity – Algorithm Structures</w:t>
+      </w:r>
+    </w:p>
+    <w:p>
+      <w:pPr>
+        <w:pStyle w:val="Normal"/>
+        <w:rPr>
+          <w:b w:val="false"/>
+          <w:b w:val="false"/>
+          <w:bCs w:val="false"/>
+        </w:rPr>
+      </w:pPr>
+      <w:r>
+        <w:rPr>
+          <w:b w:val="false"/>
+          <w:bCs w:val="false"/>
+        </w:rPr>
+        <w:t xml:space="preserve">   </w:t>
+      </w:r>
+      <w:r>
+        <w:rPr>
+          <w:b w:val="false"/>
+          <w:bCs w:val="false"/>
+        </w:rPr>
+        <w:t>3.1 Example 1: Checking Voting Eligibility</w:t>
+      </w:r>
+    </w:p>
+    <w:p>
+      <w:pPr>
+        <w:pStyle w:val="Normal"/>
+        <w:rPr>
+          <w:b w:val="false"/>
+          <w:b w:val="false"/>
+          <w:bCs w:val="false"/>
+        </w:rPr>
+      </w:pPr>
+      <w:r>
+        <w:rPr>
+          <w:b w:val="false"/>
+          <w:bCs w:val="false"/>
+        </w:rPr>
+        <w:t xml:space="preserve">       </w:t>
+      </w:r>
+      <w:r>
+        <w:rPr>
+          <w:b w:val="false"/>
+          <w:bCs w:val="false"/>
+        </w:rPr>
+        <w:t>3.1.1 Problem Definition</w:t>
+      </w:r>
+    </w:p>
+    <w:p>
+      <w:pPr>
+        <w:pStyle w:val="Normal"/>
+        <w:rPr>
+          <w:b w:val="false"/>
+          <w:b w:val="false"/>
+          <w:bCs w:val="false"/>
+        </w:rPr>
+      </w:pPr>
+      <w:r>
+        <w:rPr>
+          <w:b w:val="false"/>
+          <w:bCs w:val="false"/>
+        </w:rPr>
+        <w:t xml:space="preserve">       </w:t>
+      </w:r>
+      <w:r>
+        <w:rPr>
+          <w:b w:val="false"/>
+          <w:bCs w:val="false"/>
+        </w:rPr>
+        <w:t>3.1.2 Identifying Key Processes</w:t>
+      </w:r>
+    </w:p>
+    <w:p>
+      <w:pPr>
+        <w:pStyle w:val="Normal"/>
+        <w:rPr>
+          <w:b w:val="false"/>
+          <w:b w:val="false"/>
+          <w:bCs w:val="false"/>
+        </w:rPr>
+      </w:pPr>
+      <w:r>
+        <w:rPr>
+          <w:b w:val="false"/>
+          <w:bCs w:val="false"/>
+        </w:rPr>
+        <w:t xml:space="preserve">       </w:t>
+      </w:r>
+      <w:r>
+        <w:rPr>
+          <w:b w:val="false"/>
+          <w:bCs w:val="false"/>
+        </w:rPr>
+        <w:t>3.1.3 Choosing the Algorithm Structure</w:t>
+      </w:r>
+    </w:p>
+    <w:p>
+      <w:pPr>
+        <w:pStyle w:val="Normal"/>
+        <w:rPr>
+          <w:b w:val="false"/>
+          <w:b w:val="false"/>
+          <w:bCs w:val="false"/>
+        </w:rPr>
+      </w:pPr>
+      <w:r>
+        <w:rPr>
+          <w:b w:val="false"/>
+          <w:bCs w:val="false"/>
+        </w:rPr>
+        <w:t xml:space="preserve">       </w:t>
+      </w:r>
+      <w:r>
+        <w:rPr>
+          <w:b w:val="false"/>
+          <w:bCs w:val="false"/>
+        </w:rPr>
+        <w:t>3.1.4 Writing the Pseudocode</w:t>
+      </w:r>
+    </w:p>
+    <w:p>
+      <w:pPr>
+        <w:pStyle w:val="Normal"/>
+        <w:rPr>
+          <w:b w:val="false"/>
+          <w:b w:val="false"/>
+          <w:bCs w:val="false"/>
+        </w:rPr>
+      </w:pPr>
+      <w:r>
+        <w:rPr>
+          <w:b w:val="false"/>
+          <w:bCs w:val="false"/>
+        </w:rPr>
+        <w:t xml:space="preserve">   </w:t>
+      </w:r>
+      <w:r>
+        <w:rPr>
+          <w:b w:val="false"/>
+          <w:bCs w:val="false"/>
+        </w:rPr>
+        <w:t>3.2 Example 2: Categorizing Festival Attendees</w:t>
+      </w:r>
+    </w:p>
+    <w:p>
+      <w:pPr>
+        <w:pStyle w:val="Normal"/>
+        <w:rPr>
+          <w:b w:val="false"/>
+          <w:b w:val="false"/>
+          <w:bCs w:val="false"/>
+        </w:rPr>
+      </w:pPr>
+      <w:r>
+        <w:rPr>
+          <w:b w:val="false"/>
+          <w:bCs w:val="false"/>
+        </w:rPr>
+        <w:t xml:space="preserve">       </w:t>
+      </w:r>
+      <w:r>
+        <w:rPr>
+          <w:b w:val="false"/>
+          <w:bCs w:val="false"/>
+        </w:rPr>
+        <w:t>3.2.1 Problem Definition</w:t>
+      </w:r>
+    </w:p>
+    <w:p>
+      <w:pPr>
+        <w:pStyle w:val="Normal"/>
+        <w:rPr>
+          <w:b w:val="false"/>
+          <w:b w:val="false"/>
+          <w:bCs w:val="false"/>
+        </w:rPr>
+      </w:pPr>
+      <w:r>
+        <w:rPr>
+          <w:b w:val="false"/>
+          <w:bCs w:val="false"/>
+        </w:rPr>
+        <w:t xml:space="preserve">       </w:t>
+      </w:r>
+      <w:r>
+        <w:rPr>
+          <w:b w:val="false"/>
+          <w:bCs w:val="false"/>
+        </w:rPr>
+        <w:t>3.2.2 Identifying Key Processes</w:t>
+      </w:r>
+    </w:p>
+    <w:p>
+      <w:pPr>
+        <w:pStyle w:val="Normal"/>
+        <w:rPr>
+          <w:b w:val="false"/>
+          <w:b w:val="false"/>
+          <w:bCs w:val="false"/>
+        </w:rPr>
+      </w:pPr>
+      <w:r>
+        <w:rPr>
+          <w:b w:val="false"/>
+          <w:bCs w:val="false"/>
+        </w:rPr>
+        <w:t xml:space="preserve">       </w:t>
+      </w:r>
+      <w:r>
+        <w:rPr>
+          <w:b w:val="false"/>
+          <w:bCs w:val="false"/>
+        </w:rPr>
+        <w:t>3.2.3 Choosing the Algorithm Structure</w:t>
+      </w:r>
+    </w:p>
+    <w:p>
+      <w:pPr>
+        <w:pStyle w:val="Normal"/>
+        <w:rPr>
+          <w:b w:val="false"/>
+          <w:b w:val="false"/>
+          <w:bCs w:val="false"/>
+        </w:rPr>
+      </w:pPr>
+      <w:r>
+        <w:rPr>
+          <w:b w:val="false"/>
+          <w:bCs w:val="false"/>
+        </w:rPr>
+        <w:t xml:space="preserve">       </w:t>
+      </w:r>
+      <w:r>
+        <w:rPr>
+          <w:b w:val="false"/>
+          <w:bCs w:val="false"/>
+        </w:rPr>
+        <w:t>3.2.4 Writing the Pseudocode</w:t>
+      </w:r>
+    </w:p>
+    <w:p>
+      <w:pPr>
+        <w:pStyle w:val="Normal"/>
+        <w:rPr>
+          <w:b w:val="false"/>
+          <w:b w:val="false"/>
+          <w:bCs w:val="false"/>
+        </w:rPr>
+      </w:pPr>
+      <w:r>
+        <w:rPr>
+          <w:b w:val="false"/>
+          <w:bCs w:val="false"/>
+        </w:rPr>
+        <w:t xml:space="preserve">   </w:t>
+      </w:r>
+      <w:r>
+        <w:rPr>
+          <w:b w:val="false"/>
+          <w:bCs w:val="false"/>
+        </w:rPr>
+        <w:t>3.3 Example 3: Grading System</w:t>
+      </w:r>
+    </w:p>
+    <w:p>
+      <w:pPr>
+        <w:pStyle w:val="Normal"/>
+        <w:rPr>
+          <w:b w:val="false"/>
+          <w:b w:val="false"/>
+          <w:bCs w:val="false"/>
+        </w:rPr>
+      </w:pPr>
+      <w:r>
+        <w:rPr>
+          <w:b w:val="false"/>
+          <w:bCs w:val="false"/>
+        </w:rPr>
+        <w:t xml:space="preserve">       </w:t>
+      </w:r>
+      <w:r>
+        <w:rPr>
+          <w:b w:val="false"/>
+          <w:bCs w:val="false"/>
+        </w:rPr>
+        <w:t>3.3.1 Problem Definition</w:t>
+      </w:r>
+    </w:p>
+    <w:p>
+      <w:pPr>
+        <w:pStyle w:val="Normal"/>
+        <w:rPr>
+          <w:b w:val="false"/>
+          <w:b w:val="false"/>
+          <w:bCs w:val="false"/>
+        </w:rPr>
+      </w:pPr>
+      <w:r>
+        <w:rPr>
+          <w:b w:val="false"/>
+          <w:bCs w:val="false"/>
+        </w:rPr>
+        <w:t xml:space="preserve">       </w:t>
+      </w:r>
+      <w:r>
+        <w:rPr>
+          <w:b w:val="false"/>
+          <w:bCs w:val="false"/>
+        </w:rPr>
+        <w:t>3.3.2 Identifying Key Processes</w:t>
+      </w:r>
+    </w:p>
+    <w:p>
+      <w:pPr>
+        <w:pStyle w:val="Normal"/>
+        <w:rPr>
+          <w:b w:val="false"/>
+          <w:b w:val="false"/>
+          <w:bCs w:val="false"/>
+        </w:rPr>
+      </w:pPr>
+      <w:r>
+        <w:rPr>
+          <w:b w:val="false"/>
+          <w:bCs w:val="false"/>
+        </w:rPr>
+        <w:t xml:space="preserve">       </w:t>
+      </w:r>
+      <w:r>
+        <w:rPr>
+          <w:b w:val="false"/>
+          <w:bCs w:val="false"/>
+        </w:rPr>
+        <w:t>3.3.3 Choosing the Algorithm Structure</w:t>
+      </w:r>
+    </w:p>
+    <w:p>
+      <w:pPr>
+        <w:pStyle w:val="Normal"/>
+        <w:rPr>
+          <w:b w:val="false"/>
+          <w:b w:val="false"/>
+          <w:bCs w:val="false"/>
+        </w:rPr>
+      </w:pPr>
+      <w:r>
+        <w:rPr>
+          <w:b w:val="false"/>
+          <w:bCs w:val="false"/>
+        </w:rPr>
+        <w:t xml:space="preserve">       </w:t>
+      </w:r>
+      <w:r>
+        <w:rPr>
+          <w:b w:val="false"/>
+          <w:bCs w:val="false"/>
+        </w:rPr>
+        <w:t>3.3.4 Writing the Pseudocode</w:t>
+      </w:r>
+    </w:p>
+    <w:p>
+      <w:pPr>
+        <w:pStyle w:val="Normal"/>
+        <w:rPr>
+          <w:b w:val="false"/>
+          <w:b w:val="false"/>
+          <w:bCs w:val="false"/>
+        </w:rPr>
+      </w:pPr>
+      <w:r>
+        <w:rPr>
+          <w:b w:val="false"/>
+          <w:bCs w:val="false"/>
+        </w:rPr>
+      </w:r>
+    </w:p>
+    <w:p>
+      <w:pPr>
+        <w:pStyle w:val="Normal"/>
+        <w:rPr>
+          <w:b w:val="false"/>
+          <w:b w:val="false"/>
+          <w:bCs w:val="false"/>
+        </w:rPr>
+      </w:pPr>
+      <w:r>
+        <w:rPr>
+          <w:b w:val="false"/>
+          <w:bCs w:val="false"/>
+        </w:rPr>
+        <w:t>4. Visualizing Logic With Flowcharts</w:t>
+      </w:r>
+    </w:p>
+    <w:p>
+      <w:pPr>
+        <w:pStyle w:val="Normal"/>
+        <w:rPr>
+          <w:b w:val="false"/>
+          <w:b w:val="false"/>
+          <w:bCs w:val="false"/>
+        </w:rPr>
+      </w:pPr>
+      <w:r>
+        <w:rPr>
+          <w:b w:val="false"/>
+          <w:bCs w:val="false"/>
+        </w:rPr>
+        <w:t xml:space="preserve">   </w:t>
+      </w:r>
+      <w:r>
+        <w:rPr>
+          <w:b w:val="false"/>
+          <w:bCs w:val="false"/>
+        </w:rPr>
+        <w:t>4.1 Introduction to Flowcharts</w:t>
+      </w:r>
+    </w:p>
+    <w:p>
+      <w:pPr>
+        <w:pStyle w:val="Normal"/>
+        <w:rPr>
+          <w:b w:val="false"/>
+          <w:b w:val="false"/>
+          <w:bCs w:val="false"/>
+        </w:rPr>
+      </w:pPr>
+      <w:r>
+        <w:rPr>
+          <w:b w:val="false"/>
+          <w:bCs w:val="false"/>
+        </w:rPr>
+        <w:t xml:space="preserve">   </w:t>
+      </w:r>
+      <w:r>
+        <w:rPr>
+          <w:b w:val="false"/>
+          <w:bCs w:val="false"/>
+        </w:rPr>
+        <w:t>4.2 Visualizing Logical Steps with Flowcharts</w:t>
+      </w:r>
+    </w:p>
+    <w:p>
+      <w:pPr>
+        <w:pStyle w:val="Normal"/>
+        <w:rPr>
+          <w:b w:val="false"/>
+          <w:b w:val="false"/>
+          <w:bCs w:val="false"/>
+        </w:rPr>
+      </w:pPr>
+      <w:r>
+        <w:rPr>
+          <w:b w:val="false"/>
+          <w:bCs w:val="false"/>
+        </w:rPr>
+        <w:t xml:space="preserve">   </w:t>
+      </w:r>
+      <w:r>
+        <w:rPr>
+          <w:b w:val="false"/>
+          <w:bCs w:val="false"/>
+        </w:rPr>
+        <w:t>4.3 Key Components of Flowcharts</w:t>
+      </w:r>
+    </w:p>
+    <w:p>
+      <w:pPr>
+        <w:pStyle w:val="Normal"/>
+        <w:rPr>
+          <w:b w:val="false"/>
+          <w:b w:val="false"/>
+          <w:bCs w:val="false"/>
+        </w:rPr>
+      </w:pPr>
+      <w:r>
+        <w:rPr>
+          <w:b w:val="false"/>
+          <w:bCs w:val="false"/>
+        </w:rPr>
+        <w:t xml:space="preserve">   </w:t>
+      </w:r>
+      <w:r>
+        <w:rPr>
+          <w:b w:val="false"/>
+          <w:bCs w:val="false"/>
+        </w:rPr>
+        <w:t>4.4 Steps to Create Effective Flowcharts</w:t>
+      </w:r>
+    </w:p>
+    <w:p>
+      <w:pPr>
+        <w:pStyle w:val="Normal"/>
+        <w:rPr>
+          <w:b w:val="false"/>
+          <w:b w:val="false"/>
+          <w:bCs w:val="false"/>
+        </w:rPr>
+      </w:pPr>
+      <w:r>
+        <w:rPr>
+          <w:b w:val="false"/>
+          <w:bCs w:val="false"/>
+        </w:rPr>
+        <w:t xml:space="preserve">   </w:t>
+      </w:r>
+      <w:r>
+        <w:rPr>
+          <w:b w:val="false"/>
+          <w:bCs w:val="false"/>
+        </w:rPr>
+        <w:t>4.5 Analyzing Flowcharts for Accuracy</w:t>
+      </w:r>
+    </w:p>
+    <w:p>
+      <w:pPr>
+        <w:pStyle w:val="Normal"/>
+        <w:rPr>
+          <w:b w:val="false"/>
+          <w:b w:val="false"/>
+          <w:bCs w:val="false"/>
+        </w:rPr>
+      </w:pPr>
+      <w:r>
+        <w:rPr>
+          <w:b w:val="false"/>
+          <w:bCs w:val="false"/>
+        </w:rPr>
+        <w:t xml:space="preserve">   </w:t>
+      </w:r>
+      <w:r>
+        <w:rPr>
+          <w:b w:val="false"/>
+          <w:bCs w:val="false"/>
+        </w:rPr>
+        <w:t>4.6 Common Mistakes in Flowcharting</w:t>
+      </w:r>
+    </w:p>
+    <w:p>
+      <w:pPr>
+        <w:pStyle w:val="Normal"/>
+        <w:rPr>
+          <w:b w:val="false"/>
+          <w:b w:val="false"/>
+          <w:bCs w:val="false"/>
+        </w:rPr>
+      </w:pPr>
+      <w:r>
+        <w:rPr>
+          <w:b w:val="false"/>
+          <w:bCs w:val="false"/>
+        </w:rPr>
+      </w:r>
+    </w:p>
+    <w:p>
+      <w:pPr>
+        <w:pStyle w:val="Normal"/>
+        <w:rPr>
+          <w:b w:val="false"/>
+          <w:b w:val="false"/>
+          <w:bCs w:val="false"/>
+        </w:rPr>
+      </w:pPr>
+      <w:r>
+        <w:rPr>
+          <w:b w:val="false"/>
+          <w:bCs w:val="false"/>
+        </w:rPr>
+        <w:t>5. Data Types</w:t>
+      </w:r>
+    </w:p>
+    <w:p>
+      <w:pPr>
+        <w:pStyle w:val="Normal"/>
+        <w:rPr>
+          <w:b w:val="false"/>
+          <w:b w:val="false"/>
+          <w:bCs w:val="false"/>
+        </w:rPr>
+      </w:pPr>
+      <w:r>
+        <w:rPr>
+          <w:b w:val="false"/>
+          <w:bCs w:val="false"/>
+        </w:rPr>
+        <w:t xml:space="preserve">   </w:t>
+      </w:r>
+      <w:r>
+        <w:rPr>
+          <w:b w:val="false"/>
+          <w:bCs w:val="false"/>
+        </w:rPr>
+        <w:t>5.1 Introduction to Data Types</w:t>
+      </w:r>
+    </w:p>
+    <w:p>
+      <w:pPr>
+        <w:pStyle w:val="Normal"/>
+        <w:rPr>
+          <w:b w:val="false"/>
+          <w:b w:val="false"/>
+          <w:bCs w:val="false"/>
+        </w:rPr>
+      </w:pPr>
+      <w:r>
+        <w:rPr>
+          <w:b w:val="false"/>
+          <w:bCs w:val="false"/>
+        </w:rPr>
+        <w:t xml:space="preserve">   </w:t>
+      </w:r>
+      <w:r>
+        <w:rPr>
+          <w:b w:val="false"/>
+          <w:bCs w:val="false"/>
+        </w:rPr>
+        <w:t>5.2 Fundamental Data Types</w:t>
+      </w:r>
+    </w:p>
+    <w:p>
+      <w:pPr>
+        <w:pStyle w:val="Normal"/>
+        <w:rPr>
+          <w:b w:val="false"/>
+          <w:b w:val="false"/>
+          <w:bCs w:val="false"/>
+        </w:rPr>
+      </w:pPr>
+      <w:r>
+        <w:rPr>
+          <w:b w:val="false"/>
+          <w:bCs w:val="false"/>
+        </w:rPr>
+        <w:t xml:space="preserve">   </w:t>
+      </w:r>
+      <w:r>
+        <w:rPr>
+          <w:b w:val="false"/>
+          <w:bCs w:val="false"/>
+        </w:rPr>
+        <w:t>5.3 Identification and Categorization of Data Types</w:t>
+      </w:r>
+    </w:p>
+    <w:p>
+      <w:pPr>
+        <w:pStyle w:val="Normal"/>
+        <w:rPr>
+          <w:b w:val="false"/>
+          <w:b w:val="false"/>
+          <w:bCs w:val="false"/>
+        </w:rPr>
+      </w:pPr>
+      <w:r>
+        <w:rPr>
+          <w:b w:val="false"/>
+          <w:bCs w:val="false"/>
+        </w:rPr>
+        <w:t xml:space="preserve">   </w:t>
+      </w:r>
+      <w:r>
+        <w:rPr>
+          <w:b w:val="false"/>
+          <w:bCs w:val="false"/>
+        </w:rPr>
+        <w:t>5.4 Data Type Conversion</w:t>
+      </w:r>
+    </w:p>
+    <w:p>
+      <w:pPr>
+        <w:pStyle w:val="Normal"/>
+        <w:rPr>
+          <w:b w:val="false"/>
+          <w:b w:val="false"/>
+          <w:bCs w:val="false"/>
+        </w:rPr>
+      </w:pPr>
+      <w:r>
+        <w:rPr>
+          <w:b w:val="false"/>
+          <w:bCs w:val="false"/>
+        </w:rPr>
+      </w:r>
+    </w:p>
+    <w:p>
+      <w:pPr>
+        <w:pStyle w:val="Normal"/>
+        <w:rPr>
+          <w:b w:val="false"/>
+          <w:b w:val="false"/>
+          <w:bCs w:val="false"/>
+        </w:rPr>
+      </w:pPr>
+      <w:r>
+        <w:rPr>
+          <w:b w:val="false"/>
+          <w:bCs w:val="false"/>
+        </w:rPr>
+        <w:t>6. Identifying and Categorizing Data Types – Examples</w:t>
+      </w:r>
+    </w:p>
+    <w:p>
+      <w:pPr>
+        <w:pStyle w:val="Normal"/>
+        <w:rPr>
+          <w:b w:val="false"/>
+          <w:b w:val="false"/>
+          <w:bCs w:val="false"/>
+        </w:rPr>
+      </w:pPr>
+      <w:r>
+        <w:rPr>
+          <w:b w:val="false"/>
+          <w:bCs w:val="false"/>
+        </w:rPr>
+        <w:t xml:space="preserve">   </w:t>
+      </w:r>
+      <w:r>
+        <w:rPr>
+          <w:b w:val="false"/>
+          <w:bCs w:val="false"/>
+        </w:rPr>
+        <w:t>6.1 Example: 3.14 (Double)</w:t>
+      </w:r>
+    </w:p>
+    <w:p>
+      <w:pPr>
+        <w:pStyle w:val="Normal"/>
+        <w:rPr>
+          <w:b w:val="false"/>
+          <w:b w:val="false"/>
+          <w:bCs w:val="false"/>
+        </w:rPr>
+      </w:pPr>
+      <w:r>
+        <w:rPr>
+          <w:b w:val="false"/>
+          <w:bCs w:val="false"/>
+        </w:rPr>
+        <w:t xml:space="preserve">   </w:t>
+      </w:r>
+      <w:r>
+        <w:rPr>
+          <w:b w:val="false"/>
+          <w:bCs w:val="false"/>
+        </w:rPr>
+        <w:t>6.2 Example: "3.14" (String)</w:t>
+      </w:r>
+    </w:p>
+    <w:p>
+      <w:pPr>
+        <w:pStyle w:val="Normal"/>
+        <w:rPr>
+          <w:b w:val="false"/>
+          <w:b w:val="false"/>
+          <w:bCs w:val="false"/>
+        </w:rPr>
+      </w:pPr>
+      <w:r>
+        <w:rPr>
+          <w:b w:val="false"/>
+          <w:bCs w:val="false"/>
+        </w:rPr>
+        <w:t xml:space="preserve">   </w:t>
+      </w:r>
+      <w:r>
+        <w:rPr>
+          <w:b w:val="false"/>
+          <w:bCs w:val="false"/>
+        </w:rPr>
+        <w:t>6.3 Example: 42 (Integer)</w:t>
+      </w:r>
+    </w:p>
+    <w:p>
+      <w:pPr>
+        <w:pStyle w:val="Normal"/>
+        <w:rPr>
+          <w:b w:val="false"/>
+          <w:b w:val="false"/>
+          <w:bCs w:val="false"/>
+        </w:rPr>
+      </w:pPr>
+      <w:r>
+        <w:rPr>
+          <w:b w:val="false"/>
+          <w:bCs w:val="false"/>
+        </w:rPr>
+        <w:t xml:space="preserve">   </w:t>
+      </w:r>
+      <w:r>
+        <w:rPr>
+          <w:b w:val="false"/>
+          <w:bCs w:val="false"/>
+        </w:rPr>
+        <w:t>6.4 Example: true (Boolean)</w:t>
+      </w:r>
+    </w:p>
+    <w:p>
+      <w:pPr>
+        <w:pStyle w:val="Normal"/>
+        <w:rPr>
+          <w:b w:val="false"/>
+          <w:b w:val="false"/>
+          <w:bCs w:val="false"/>
+        </w:rPr>
+      </w:pPr>
+      <w:r>
+        <w:rPr>
+          <w:b w:val="false"/>
+          <w:bCs w:val="false"/>
+        </w:rPr>
+      </w:r>
+    </w:p>
+    <w:p>
+      <w:pPr>
+        <w:pStyle w:val="Normal"/>
+        <w:rPr>
+          <w:b w:val="false"/>
+          <w:b w:val="false"/>
+          <w:bCs w:val="false"/>
+        </w:rPr>
+      </w:pPr>
+      <w:r>
+        <w:rPr>
+          <w:b w:val="false"/>
+          <w:bCs w:val="false"/>
+        </w:rPr>
+        <w:t>7. Variables in C#</w:t>
+      </w:r>
+    </w:p>
+    <w:p>
+      <w:pPr>
+        <w:pStyle w:val="Normal"/>
+        <w:rPr>
+          <w:b w:val="false"/>
+          <w:b w:val="false"/>
+          <w:bCs w:val="false"/>
+        </w:rPr>
+      </w:pPr>
+      <w:r>
+        <w:rPr>
+          <w:b w:val="false"/>
+          <w:bCs w:val="false"/>
+        </w:rPr>
+        <w:t xml:space="preserve">   </w:t>
+      </w:r>
+      <w:r>
+        <w:rPr>
+          <w:b w:val="false"/>
+          <w:bCs w:val="false"/>
+        </w:rPr>
+        <w:t>7.1 Understanding Variables</w:t>
+      </w:r>
+    </w:p>
+    <w:p>
+      <w:pPr>
+        <w:pStyle w:val="Normal"/>
+        <w:rPr>
+          <w:b w:val="false"/>
+          <w:b w:val="false"/>
+          <w:bCs w:val="false"/>
+        </w:rPr>
+      </w:pPr>
+      <w:r>
+        <w:rPr>
+          <w:b w:val="false"/>
+          <w:bCs w:val="false"/>
+        </w:rPr>
+        <w:t xml:space="preserve">   </w:t>
+      </w:r>
+      <w:r>
+        <w:rPr>
+          <w:b w:val="false"/>
+          <w:bCs w:val="false"/>
+        </w:rPr>
+        <w:t>7.2 Key Types of Variables</w:t>
+      </w:r>
+    </w:p>
+    <w:p>
+      <w:pPr>
+        <w:pStyle w:val="Normal"/>
+        <w:rPr>
+          <w:b w:val="false"/>
+          <w:b w:val="false"/>
+          <w:bCs w:val="false"/>
+        </w:rPr>
+      </w:pPr>
+      <w:r>
+        <w:rPr>
+          <w:b w:val="false"/>
+          <w:bCs w:val="false"/>
+        </w:rPr>
+        <w:t xml:space="preserve">   </w:t>
+      </w:r>
+      <w:r>
+        <w:rPr>
+          <w:b w:val="false"/>
+          <w:bCs w:val="false"/>
+        </w:rPr>
+        <w:t>7.3 Declaring and Initializing Variables</w:t>
+      </w:r>
+    </w:p>
+    <w:p>
+      <w:pPr>
+        <w:pStyle w:val="Normal"/>
+        <w:rPr>
+          <w:b w:val="false"/>
+          <w:b w:val="false"/>
+          <w:bCs w:val="false"/>
+        </w:rPr>
+      </w:pPr>
+      <w:r>
+        <w:rPr>
+          <w:b w:val="false"/>
+          <w:bCs w:val="false"/>
+        </w:rPr>
+        <w:t xml:space="preserve">   </w:t>
+      </w:r>
+      <w:r>
+        <w:rPr>
+          <w:b w:val="false"/>
+          <w:bCs w:val="false"/>
+        </w:rPr>
+        <w:t>7.4 Mutable vs. Immutable Variables</w:t>
+      </w:r>
+    </w:p>
+    <w:p>
+      <w:pPr>
+        <w:pStyle w:val="Normal"/>
+        <w:rPr>
+          <w:b w:val="false"/>
+          <w:b w:val="false"/>
+          <w:bCs w:val="false"/>
+        </w:rPr>
+      </w:pPr>
+      <w:r>
+        <w:rPr>
+          <w:b w:val="false"/>
+          <w:bCs w:val="false"/>
+        </w:rPr>
+        <w:t xml:space="preserve">   </w:t>
+      </w:r>
+      <w:r>
+        <w:rPr>
+          <w:b w:val="false"/>
+          <w:bCs w:val="false"/>
+        </w:rPr>
+        <w:t>7.5 Best Practices for Variable Management</w:t>
+      </w:r>
+    </w:p>
+    <w:p>
+      <w:pPr>
+        <w:pStyle w:val="Normal"/>
+        <w:rPr>
+          <w:b w:val="false"/>
+          <w:b w:val="false"/>
+          <w:bCs w:val="false"/>
+        </w:rPr>
+      </w:pPr>
+      <w:r>
+        <w:rPr>
+          <w:b w:val="false"/>
+          <w:bCs w:val="false"/>
+        </w:rPr>
+      </w:r>
+    </w:p>
+    <w:p>
+      <w:pPr>
+        <w:pStyle w:val="Normal"/>
+        <w:rPr>
+          <w:b w:val="false"/>
+          <w:b w:val="false"/>
+          <w:bCs w:val="false"/>
+        </w:rPr>
+      </w:pPr>
+      <w:r>
+        <w:rPr>
+          <w:b w:val="false"/>
+          <w:bCs w:val="false"/>
+        </w:rPr>
+        <w:t>8. Activity – Declaring Variables</w:t>
+      </w:r>
+    </w:p>
+    <w:p>
+      <w:pPr>
+        <w:pStyle w:val="Normal"/>
+        <w:rPr>
+          <w:b w:val="false"/>
+          <w:b w:val="false"/>
+          <w:bCs w:val="false"/>
+        </w:rPr>
+      </w:pPr>
+      <w:r>
+        <w:rPr>
+          <w:b w:val="false"/>
+          <w:bCs w:val="false"/>
+        </w:rPr>
+        <w:t xml:space="preserve">   </w:t>
+      </w:r>
+      <w:r>
+        <w:rPr>
+          <w:b w:val="false"/>
+          <w:bCs w:val="false"/>
+        </w:rPr>
+        <w:t>8.1 Example 1: Declaring and Initializing an Integer Variable</w:t>
+      </w:r>
+    </w:p>
+    <w:p>
+      <w:pPr>
+        <w:pStyle w:val="Normal"/>
+        <w:rPr>
+          <w:b w:val="false"/>
+          <w:b w:val="false"/>
+          <w:bCs w:val="false"/>
+        </w:rPr>
+      </w:pPr>
+      <w:r>
+        <w:rPr>
+          <w:b w:val="false"/>
+          <w:bCs w:val="false"/>
+        </w:rPr>
+        <w:t xml:space="preserve">   </w:t>
+      </w:r>
+      <w:r>
+        <w:rPr>
+          <w:b w:val="false"/>
+          <w:bCs w:val="false"/>
+        </w:rPr>
+        <w:t>8.2 Example 2: Declaring and Initializing a String Variable</w:t>
+      </w:r>
+    </w:p>
+    <w:p>
+      <w:pPr>
+        <w:pStyle w:val="Normal"/>
+        <w:rPr>
+          <w:b w:val="false"/>
+          <w:b w:val="false"/>
+          <w:bCs w:val="false"/>
+        </w:rPr>
+      </w:pPr>
+      <w:r>
+        <w:rPr>
+          <w:b w:val="false"/>
+          <w:bCs w:val="false"/>
+        </w:rPr>
+      </w:r>
+    </w:p>
+    <w:p>
+      <w:pPr>
+        <w:pStyle w:val="Normal"/>
+        <w:rPr>
+          <w:b w:val="false"/>
+          <w:b w:val="false"/>
+          <w:bCs w:val="false"/>
+        </w:rPr>
+      </w:pPr>
+      <w:r>
+        <w:rPr>
+          <w:b w:val="false"/>
+          <w:bCs w:val="false"/>
+        </w:rPr>
+        <w:t>9. Algorithm Design</w:t>
+      </w:r>
+    </w:p>
+    <w:p>
+      <w:pPr>
+        <w:pStyle w:val="Normal"/>
+        <w:rPr>
+          <w:b w:val="false"/>
+          <w:b w:val="false"/>
+          <w:bCs w:val="false"/>
+        </w:rPr>
+      </w:pPr>
+      <w:r>
+        <w:rPr>
+          <w:b w:val="false"/>
+          <w:bCs w:val="false"/>
+        </w:rPr>
+      </w:r>
+    </w:p>
+    <w:p>
+      <w:pPr>
+        <w:pStyle w:val="Normal"/>
+        <w:rPr>
+          <w:b w:val="false"/>
+          <w:b w:val="false"/>
+          <w:bCs w:val="false"/>
+        </w:rPr>
+      </w:pPr>
+      <w:r>
+        <w:rPr>
+          <w:b w:val="false"/>
+          <w:bCs w:val="false"/>
+        </w:rPr>
+        <w:t>10. Activity – Implementing Algorithms in C#</w:t>
+      </w:r>
+    </w:p>
+    <w:p>
+      <w:pPr>
+        <w:pStyle w:val="Normal"/>
+        <w:rPr>
+          <w:b w:val="false"/>
+          <w:b w:val="false"/>
+          <w:bCs w:val="false"/>
+        </w:rPr>
+      </w:pPr>
+      <w:r>
+        <w:rPr>
+          <w:b w:val="false"/>
+          <w:bCs w:val="false"/>
+        </w:rPr>
+        <w:t xml:space="preserve">   </w:t>
+      </w:r>
+      <w:r>
+        <w:rPr>
+          <w:b w:val="false"/>
+          <w:bCs w:val="false"/>
+        </w:rPr>
+        <w:t>10.1 Example 1: Finding the Largest Number in an Array</w:t>
+      </w:r>
+    </w:p>
+    <w:p>
+      <w:pPr>
+        <w:pStyle w:val="Normal"/>
+        <w:rPr>
+          <w:b w:val="false"/>
+          <w:b w:val="false"/>
+          <w:bCs w:val="false"/>
+        </w:rPr>
+      </w:pPr>
+      <w:r>
+        <w:rPr>
+          <w:b w:val="false"/>
+          <w:bCs w:val="false"/>
+        </w:rPr>
+        <w:t xml:space="preserve">   </w:t>
+      </w:r>
+      <w:r>
+        <w:rPr>
+          <w:b w:val="false"/>
+          <w:bCs w:val="false"/>
+        </w:rPr>
+        <w:t>10.2 Example 2: Checking If a Number is Even or Odd</w:t>
       </w:r>
     </w:p>
     <w:p>
@@ -6027,11 +7442,1348 @@
       <w:pPr>
         <w:pStyle w:val="Normal"/>
         <w:rPr>
-          <w:lang w:val="en-US"/>
-        </w:rPr>
-      </w:pPr>
-      <w:r>
-        <w:rPr>
+          <w:b/>
+          <w:b/>
+          <w:bCs/>
+          <w:sz w:val="32"/>
+          <w:szCs w:val="32"/>
+          <w:lang w:val="en-US"/>
+        </w:rPr>
+      </w:pPr>
+      <w:r>
+        <w:rPr>
+          <w:b/>
+          <w:bCs/>
+          <w:sz w:val="32"/>
+          <w:szCs w:val="32"/>
+          <w:lang w:val="en-US"/>
+        </w:rPr>
+        <w:t>Algorithm design</w:t>
+      </w:r>
+    </w:p>
+    <w:p>
+      <w:pPr>
+        <w:pStyle w:val="Normal"/>
+        <w:rPr>
+          <w:b/>
+          <w:b/>
+          <w:bCs/>
+          <w:sz w:val="32"/>
+          <w:szCs w:val="32"/>
+          <w:lang w:val="en-US"/>
+        </w:rPr>
+      </w:pPr>
+      <w:r>
+        <w:rPr>
+          <w:b/>
+          <w:bCs/>
+          <w:sz w:val="32"/>
+          <w:szCs w:val="32"/>
+          <w:lang w:val="en-US"/>
+        </w:rPr>
+        <w:drawing>
+          <wp:anchor behindDoc="0" distT="0" distB="0" distL="0" distR="0" simplePos="0" locked="0" layoutInCell="0" allowOverlap="1" relativeHeight="9">
+            <wp:simplePos x="0" y="0"/>
+            <wp:positionH relativeFrom="column">
+              <wp:align>center</wp:align>
+            </wp:positionH>
+            <wp:positionV relativeFrom="paragraph">
+              <wp:posOffset>635</wp:posOffset>
+            </wp:positionV>
+            <wp:extent cx="5760720" cy="1299210"/>
+            <wp:effectExtent l="0" t="0" r="0" b="0"/>
+            <wp:wrapSquare wrapText="largest"/>
+            <wp:docPr id="8" name="Image8" descr=""/>
+            <wp:cNvGraphicFramePr>
+              <a:graphicFrameLocks xmlns:a="http://schemas.openxmlformats.org/drawingml/2006/main" noChangeAspect="1"/>
+            </wp:cNvGraphicFramePr>
+            <a:graphic xmlns:a="http://schemas.openxmlformats.org/drawingml/2006/main">
+              <a:graphicData uri="http://schemas.openxmlformats.org/drawingml/2006/picture">
+                <pic:pic xmlns:pic="http://schemas.openxmlformats.org/drawingml/2006/picture">
+                  <pic:nvPicPr>
+                    <pic:cNvPr id="8" name="Image8" descr=""/>
+                    <pic:cNvPicPr>
+                      <a:picLocks noChangeAspect="1" noChangeArrowheads="1"/>
+                    </pic:cNvPicPr>
+                  </pic:nvPicPr>
+                  <pic:blipFill>
+                    <a:blip r:embed="rId9"/>
+                    <a:stretch>
+                      <a:fillRect/>
+                    </a:stretch>
+                  </pic:blipFill>
+                  <pic:spPr bwMode="auto">
+                    <a:xfrm>
+                      <a:off x="0" y="0"/>
+                      <a:ext cx="5760720" cy="1299210"/>
+                    </a:xfrm>
+                    <a:prstGeom prst="rect">
+                      <a:avLst/>
+                    </a:prstGeom>
+                  </pic:spPr>
+                </pic:pic>
+              </a:graphicData>
+            </a:graphic>
+          </wp:anchor>
+        </w:drawing>
+        <w:drawing>
+          <wp:anchor behindDoc="0" distT="0" distB="0" distL="0" distR="0" simplePos="0" locked="0" layoutInCell="0" allowOverlap="1" relativeHeight="10">
+            <wp:simplePos x="0" y="0"/>
+            <wp:positionH relativeFrom="column">
+              <wp:posOffset>-38100</wp:posOffset>
+            </wp:positionH>
+            <wp:positionV relativeFrom="paragraph">
+              <wp:posOffset>1339850</wp:posOffset>
+            </wp:positionV>
+            <wp:extent cx="5760720" cy="2506980"/>
+            <wp:effectExtent l="0" t="0" r="0" b="0"/>
+            <wp:wrapSquare wrapText="largest"/>
+            <wp:docPr id="9" name="Image9" descr=""/>
+            <wp:cNvGraphicFramePr>
+              <a:graphicFrameLocks xmlns:a="http://schemas.openxmlformats.org/drawingml/2006/main" noChangeAspect="1"/>
+            </wp:cNvGraphicFramePr>
+            <a:graphic xmlns:a="http://schemas.openxmlformats.org/drawingml/2006/main">
+              <a:graphicData uri="http://schemas.openxmlformats.org/drawingml/2006/picture">
+                <pic:pic xmlns:pic="http://schemas.openxmlformats.org/drawingml/2006/picture">
+                  <pic:nvPicPr>
+                    <pic:cNvPr id="9" name="Image9" descr=""/>
+                    <pic:cNvPicPr>
+                      <a:picLocks noChangeAspect="1" noChangeArrowheads="1"/>
+                    </pic:cNvPicPr>
+                  </pic:nvPicPr>
+                  <pic:blipFill>
+                    <a:blip r:embed="rId10"/>
+                    <a:stretch>
+                      <a:fillRect/>
+                    </a:stretch>
+                  </pic:blipFill>
+                  <pic:spPr bwMode="auto">
+                    <a:xfrm>
+                      <a:off x="0" y="0"/>
+                      <a:ext cx="5760720" cy="2506980"/>
+                    </a:xfrm>
+                    <a:prstGeom prst="rect">
+                      <a:avLst/>
+                    </a:prstGeom>
+                  </pic:spPr>
+                </pic:pic>
+              </a:graphicData>
+            </a:graphic>
+          </wp:anchor>
+        </w:drawing>
+      </w:r>
+    </w:p>
+    <w:p>
+      <w:pPr>
+        <w:pStyle w:val="Heading1"/>
+        <w:rPr>
+          <w:b/>
+          <w:b/>
+          <w:bCs/>
+          <w:sz w:val="32"/>
+          <w:szCs w:val="32"/>
+          <w:lang w:val="en-US"/>
+        </w:rPr>
+      </w:pPr>
+      <w:r>
+        <w:rPr>
+          <w:b/>
+          <w:bCs/>
+          <w:sz w:val="32"/>
+          <w:szCs w:val="32"/>
+          <w:lang w:val="en-US"/>
+        </w:rPr>
+        <w:t>Activity: Implementing Algorithms in C#</w:t>
+      </w:r>
+    </w:p>
+    <w:p>
+      <w:pPr>
+        <w:pStyle w:val="Heading1"/>
+        <w:rPr>
+          <w:b/>
+          <w:b/>
+          <w:bCs/>
+          <w:sz w:val="32"/>
+          <w:szCs w:val="32"/>
+          <w:lang w:val="en-US"/>
+        </w:rPr>
+      </w:pPr>
+      <w:r>
+        <w:rPr>
+          <w:b/>
+          <w:bCs/>
+          <w:sz w:val="32"/>
+          <w:szCs w:val="32"/>
+          <w:lang w:val="en-US"/>
+        </w:rPr>
+        <w:t>Example 1: Finding the Largest Number in an Array</w:t>
+      </w:r>
+    </w:p>
+    <w:p>
+      <w:pPr>
+        <w:pStyle w:val="Heading2"/>
+        <w:rPr/>
+      </w:pPr>
+      <w:r>
+        <w:rPr/>
+        <w:t>Problem Statement:</w:t>
+      </w:r>
+    </w:p>
+    <w:p>
+      <w:pPr>
+        <w:pStyle w:val="TextBody"/>
+        <w:rPr/>
+      </w:pPr>
+      <w:r>
+        <w:rPr/>
+        <w:t>Write an algorithm to find the largest number in a given array of integers.</w:t>
+      </w:r>
+    </w:p>
+    <w:p>
+      <w:pPr>
+        <w:pStyle w:val="TextBody"/>
+        <w:rPr/>
+      </w:pPr>
+      <w:r>
+        <w:rPr/>
+        <w:t>1. Pseudocode:</w:t>
+      </w:r>
+    </w:p>
+    <w:p>
+      <w:pPr>
+        <w:pStyle w:val="TextBody"/>
+        <w:rPr/>
+      </w:pPr>
+      <w:r>
+        <w:rPr>
+          <w:rStyle w:val="Variable"/>
+        </w:rPr>
+        <w:t xml:space="preserve">Start Create variable largest and set it to the first number in the array For each number in the array </w:t>
+      </w:r>
+      <w:r>
+        <w:rPr/>
+        <w:t>    </w:t>
+      </w:r>
+      <w:r>
+        <w:rPr>
+          <w:rStyle w:val="Variable"/>
+        </w:rPr>
+        <w:t xml:space="preserve">If number is greater than largest </w:t>
+      </w:r>
+      <w:r>
+        <w:rPr/>
+        <w:t>        </w:t>
+      </w:r>
+      <w:r>
+        <w:rPr>
+          <w:rStyle w:val="Variable"/>
+        </w:rPr>
+        <w:t>Set variable largest to number End For Display to user value of variable largest End</w:t>
+      </w:r>
+    </w:p>
+    <w:p>
+      <w:pPr>
+        <w:pStyle w:val="TextBody"/>
+        <w:rPr/>
+      </w:pPr>
+      <w:r>
+        <w:rPr/>
+        <w:t>2. Translation:</w:t>
+      </w:r>
+    </w:p>
+    <w:p>
+      <w:pPr>
+        <w:pStyle w:val="TextBody"/>
+        <w:numPr>
+          <w:ilvl w:val="0"/>
+          <w:numId w:val="22"/>
+        </w:numPr>
+        <w:tabs>
+          <w:tab w:val="clear" w:pos="708"/>
+          <w:tab w:val="left" w:pos="0" w:leader="none"/>
+        </w:tabs>
+        <w:ind w:left="709" w:hanging="283"/>
+        <w:rPr/>
+      </w:pPr>
+      <w:r>
+        <w:rPr/>
+        <w:t xml:space="preserve">Initialization: The array </w:t>
+      </w:r>
+      <w:r>
+        <w:rPr>
+          <w:rStyle w:val="Variable"/>
+        </w:rPr>
+        <w:t>numbers</w:t>
+      </w:r>
+      <w:r>
+        <w:rPr/>
+        <w:t xml:space="preserve"> is defined with some integer values, and </w:t>
+      </w:r>
+      <w:r>
+        <w:rPr>
+          <w:rStyle w:val="Variable"/>
+        </w:rPr>
+        <w:t>largest</w:t>
+      </w:r>
+      <w:r>
+        <w:rPr/>
+        <w:t xml:space="preserve"> is initialized to the first element of the array.</w:t>
+      </w:r>
+    </w:p>
+    <w:p>
+      <w:pPr>
+        <w:pStyle w:val="TextBody"/>
+        <w:numPr>
+          <w:ilvl w:val="0"/>
+          <w:numId w:val="22"/>
+        </w:numPr>
+        <w:tabs>
+          <w:tab w:val="clear" w:pos="708"/>
+          <w:tab w:val="left" w:pos="0" w:leader="none"/>
+        </w:tabs>
+        <w:ind w:left="709" w:hanging="283"/>
+        <w:rPr/>
+      </w:pPr>
+      <w:r>
+        <w:rPr/>
+        <w:t xml:space="preserve">Iteration: A </w:t>
+      </w:r>
+      <w:r>
+        <w:rPr>
+          <w:rStyle w:val="Variable"/>
+        </w:rPr>
+        <w:t>foreach</w:t>
+      </w:r>
+      <w:r>
+        <w:rPr/>
+        <w:t xml:space="preserve"> loop is used to iterate through each element in the array.</w:t>
+      </w:r>
+    </w:p>
+    <w:p>
+      <w:pPr>
+        <w:pStyle w:val="TextBody"/>
+        <w:numPr>
+          <w:ilvl w:val="0"/>
+          <w:numId w:val="22"/>
+        </w:numPr>
+        <w:tabs>
+          <w:tab w:val="clear" w:pos="708"/>
+          <w:tab w:val="left" w:pos="0" w:leader="none"/>
+        </w:tabs>
+        <w:ind w:left="709" w:hanging="283"/>
+        <w:rPr/>
+      </w:pPr>
+      <w:r>
+        <w:rPr/>
+        <w:t xml:space="preserve">Comparison: An </w:t>
+      </w:r>
+      <w:r>
+        <w:rPr>
+          <w:rStyle w:val="Variable"/>
+        </w:rPr>
+        <w:t>if</w:t>
+      </w:r>
+      <w:r>
+        <w:rPr/>
+        <w:t xml:space="preserve"> statement checks if the current number is greater than </w:t>
+      </w:r>
+      <w:r>
+        <w:rPr>
+          <w:rStyle w:val="Variable"/>
+        </w:rPr>
+        <w:t>largest</w:t>
+      </w:r>
+      <w:r>
+        <w:rPr/>
+        <w:t xml:space="preserve">. If it is, </w:t>
+      </w:r>
+      <w:r>
+        <w:rPr>
+          <w:rStyle w:val="Variable"/>
+        </w:rPr>
+        <w:t>largest</w:t>
+      </w:r>
+      <w:r>
+        <w:rPr/>
+        <w:t xml:space="preserve"> is updated.</w:t>
+      </w:r>
+    </w:p>
+    <w:p>
+      <w:pPr>
+        <w:pStyle w:val="TextBody"/>
+        <w:numPr>
+          <w:ilvl w:val="0"/>
+          <w:numId w:val="22"/>
+        </w:numPr>
+        <w:tabs>
+          <w:tab w:val="clear" w:pos="708"/>
+          <w:tab w:val="left" w:pos="0" w:leader="none"/>
+        </w:tabs>
+        <w:ind w:left="709" w:hanging="283"/>
+        <w:rPr/>
+      </w:pPr>
+      <w:r>
+        <w:rPr/>
+        <w:t>Output: The largest number is printed after the loop completes.</w:t>
+      </w:r>
+    </w:p>
+    <w:p>
+      <w:pPr>
+        <w:pStyle w:val="Normal"/>
+        <w:rPr>
+          <w:b/>
+          <w:b/>
+          <w:bCs/>
+          <w:sz w:val="32"/>
+          <w:szCs w:val="32"/>
+          <w:lang w:val="en-US"/>
+        </w:rPr>
+      </w:pPr>
+      <w:r>
+        <w:rPr>
+          <w:b/>
+          <w:bCs/>
+          <w:sz w:val="32"/>
+          <w:szCs w:val="32"/>
+          <w:lang w:val="en-US"/>
+        </w:rPr>
+      </w:r>
+    </w:p>
+    <w:p>
+      <w:pPr>
+        <w:pStyle w:val="Normal"/>
+        <w:rPr>
+          <w:b w:val="false"/>
+          <w:b w:val="false"/>
+          <w:bCs w:val="false"/>
+          <w:sz w:val="32"/>
+          <w:szCs w:val="32"/>
+          <w:lang w:val="en-US"/>
+        </w:rPr>
+      </w:pPr>
+      <w:r>
+        <w:rPr>
+          <w:b w:val="false"/>
+          <w:bCs w:val="false"/>
+          <w:sz w:val="32"/>
+          <w:szCs w:val="32"/>
+          <w:lang w:val="en-US"/>
+        </w:rPr>
+        <w:t>// Initialize an array of integers</w:t>
+      </w:r>
+    </w:p>
+    <w:p>
+      <w:pPr>
+        <w:pStyle w:val="Normal"/>
+        <w:rPr>
+          <w:b w:val="false"/>
+          <w:b w:val="false"/>
+          <w:bCs w:val="false"/>
+          <w:sz w:val="32"/>
+          <w:szCs w:val="32"/>
+          <w:lang w:val="en-US"/>
+        </w:rPr>
+      </w:pPr>
+      <w:r>
+        <w:rPr>
+          <w:b w:val="false"/>
+          <w:bCs w:val="false"/>
+          <w:sz w:val="32"/>
+          <w:szCs w:val="32"/>
+          <w:lang w:val="en-US"/>
+        </w:rPr>
+        <w:t>int[] numbers = { 5, 8, 3, 4, 2 };</w:t>
+      </w:r>
+    </w:p>
+    <w:p>
+      <w:pPr>
+        <w:pStyle w:val="Normal"/>
+        <w:rPr>
+          <w:b w:val="false"/>
+          <w:b w:val="false"/>
+          <w:bCs w:val="false"/>
+          <w:sz w:val="32"/>
+          <w:szCs w:val="32"/>
+          <w:lang w:val="en-US"/>
+        </w:rPr>
+      </w:pPr>
+      <w:r>
+        <w:rPr>
+          <w:b w:val="false"/>
+          <w:bCs w:val="false"/>
+          <w:sz w:val="32"/>
+          <w:szCs w:val="32"/>
+          <w:lang w:val="en-US"/>
+        </w:rPr>
+        <w:t>int largest = numbers[0];</w:t>
+      </w:r>
+    </w:p>
+    <w:p>
+      <w:pPr>
+        <w:pStyle w:val="Normal"/>
+        <w:rPr>
+          <w:b w:val="false"/>
+          <w:b w:val="false"/>
+          <w:bCs w:val="false"/>
+          <w:sz w:val="32"/>
+          <w:szCs w:val="32"/>
+          <w:lang w:val="en-US"/>
+        </w:rPr>
+      </w:pPr>
+      <w:r>
+        <w:rPr>
+          <w:b w:val="false"/>
+          <w:bCs w:val="false"/>
+          <w:sz w:val="32"/>
+          <w:szCs w:val="32"/>
+          <w:lang w:val="en-US"/>
+        </w:rPr>
+        <w:t>// Loop through each number in the array</w:t>
+      </w:r>
+    </w:p>
+    <w:p>
+      <w:pPr>
+        <w:pStyle w:val="Normal"/>
+        <w:rPr>
+          <w:b w:val="false"/>
+          <w:b w:val="false"/>
+          <w:bCs w:val="false"/>
+          <w:sz w:val="32"/>
+          <w:szCs w:val="32"/>
+          <w:lang w:val="en-US"/>
+        </w:rPr>
+      </w:pPr>
+      <w:r>
+        <w:rPr>
+          <w:b w:val="false"/>
+          <w:bCs w:val="false"/>
+          <w:sz w:val="32"/>
+          <w:szCs w:val="32"/>
+          <w:lang w:val="en-US"/>
+        </w:rPr>
+        <w:t>foreach (int number in numbers)</w:t>
+      </w:r>
+    </w:p>
+    <w:p>
+      <w:pPr>
+        <w:pStyle w:val="Normal"/>
+        <w:rPr>
+          <w:b w:val="false"/>
+          <w:b w:val="false"/>
+          <w:bCs w:val="false"/>
+          <w:sz w:val="32"/>
+          <w:szCs w:val="32"/>
+          <w:lang w:val="en-US"/>
+        </w:rPr>
+      </w:pPr>
+      <w:r>
+        <w:rPr>
+          <w:b w:val="false"/>
+          <w:bCs w:val="false"/>
+          <w:sz w:val="32"/>
+          <w:szCs w:val="32"/>
+          <w:lang w:val="en-US"/>
+        </w:rPr>
+        <w:t>{</w:t>
+      </w:r>
+    </w:p>
+    <w:p>
+      <w:pPr>
+        <w:pStyle w:val="Normal"/>
+        <w:rPr>
+          <w:b w:val="false"/>
+          <w:b w:val="false"/>
+          <w:bCs w:val="false"/>
+          <w:sz w:val="32"/>
+          <w:szCs w:val="32"/>
+          <w:lang w:val="en-US"/>
+        </w:rPr>
+      </w:pPr>
+      <w:r>
+        <w:rPr>
+          <w:b w:val="false"/>
+          <w:bCs w:val="false"/>
+          <w:sz w:val="32"/>
+          <w:szCs w:val="32"/>
+          <w:lang w:val="en-US"/>
+        </w:rPr>
+        <w:t xml:space="preserve">    </w:t>
+      </w:r>
+      <w:r>
+        <w:rPr>
+          <w:b w:val="false"/>
+          <w:bCs w:val="false"/>
+          <w:sz w:val="32"/>
+          <w:szCs w:val="32"/>
+          <w:lang w:val="en-US"/>
+        </w:rPr>
+        <w:t>// Check if the current number is greater than the largest</w:t>
+      </w:r>
+    </w:p>
+    <w:p>
+      <w:pPr>
+        <w:pStyle w:val="Normal"/>
+        <w:rPr>
+          <w:b w:val="false"/>
+          <w:b w:val="false"/>
+          <w:bCs w:val="false"/>
+          <w:sz w:val="32"/>
+          <w:szCs w:val="32"/>
+          <w:lang w:val="en-US"/>
+        </w:rPr>
+      </w:pPr>
+      <w:r>
+        <w:rPr>
+          <w:b w:val="false"/>
+          <w:bCs w:val="false"/>
+          <w:sz w:val="32"/>
+          <w:szCs w:val="32"/>
+          <w:lang w:val="en-US"/>
+        </w:rPr>
+        <w:t xml:space="preserve">    </w:t>
+      </w:r>
+      <w:r>
+        <w:rPr>
+          <w:b w:val="false"/>
+          <w:bCs w:val="false"/>
+          <w:sz w:val="32"/>
+          <w:szCs w:val="32"/>
+          <w:lang w:val="en-US"/>
+        </w:rPr>
+        <w:t>if (number &gt; largest)</w:t>
+      </w:r>
+    </w:p>
+    <w:p>
+      <w:pPr>
+        <w:pStyle w:val="Normal"/>
+        <w:rPr>
+          <w:b w:val="false"/>
+          <w:b w:val="false"/>
+          <w:bCs w:val="false"/>
+          <w:sz w:val="32"/>
+          <w:szCs w:val="32"/>
+          <w:lang w:val="en-US"/>
+        </w:rPr>
+      </w:pPr>
+      <w:r>
+        <w:rPr>
+          <w:b w:val="false"/>
+          <w:bCs w:val="false"/>
+          <w:sz w:val="32"/>
+          <w:szCs w:val="32"/>
+          <w:lang w:val="en-US"/>
+        </w:rPr>
+        <w:t xml:space="preserve">    </w:t>
+      </w:r>
+      <w:r>
+        <w:rPr>
+          <w:b w:val="false"/>
+          <w:bCs w:val="false"/>
+          <w:sz w:val="32"/>
+          <w:szCs w:val="32"/>
+          <w:lang w:val="en-US"/>
+        </w:rPr>
+        <w:t>{</w:t>
+      </w:r>
+    </w:p>
+    <w:p>
+      <w:pPr>
+        <w:pStyle w:val="Normal"/>
+        <w:rPr>
+          <w:b w:val="false"/>
+          <w:b w:val="false"/>
+          <w:bCs w:val="false"/>
+          <w:sz w:val="32"/>
+          <w:szCs w:val="32"/>
+          <w:lang w:val="en-US"/>
+        </w:rPr>
+      </w:pPr>
+      <w:r>
+        <w:rPr>
+          <w:b w:val="false"/>
+          <w:bCs w:val="false"/>
+          <w:sz w:val="32"/>
+          <w:szCs w:val="32"/>
+          <w:lang w:val="en-US"/>
+        </w:rPr>
+        <w:t xml:space="preserve">        </w:t>
+      </w:r>
+      <w:r>
+        <w:rPr>
+          <w:b w:val="false"/>
+          <w:bCs w:val="false"/>
+          <w:sz w:val="32"/>
+          <w:szCs w:val="32"/>
+          <w:lang w:val="en-US"/>
+        </w:rPr>
+        <w:t>largest = number;</w:t>
+      </w:r>
+    </w:p>
+    <w:p>
+      <w:pPr>
+        <w:pStyle w:val="Normal"/>
+        <w:rPr>
+          <w:b w:val="false"/>
+          <w:b w:val="false"/>
+          <w:bCs w:val="false"/>
+          <w:sz w:val="32"/>
+          <w:szCs w:val="32"/>
+          <w:lang w:val="en-US"/>
+        </w:rPr>
+      </w:pPr>
+      <w:r>
+        <w:rPr>
+          <w:b w:val="false"/>
+          <w:bCs w:val="false"/>
+          <w:sz w:val="32"/>
+          <w:szCs w:val="32"/>
+          <w:lang w:val="en-US"/>
+        </w:rPr>
+        <w:t xml:space="preserve">    </w:t>
+      </w:r>
+      <w:r>
+        <w:rPr>
+          <w:b w:val="false"/>
+          <w:bCs w:val="false"/>
+          <w:sz w:val="32"/>
+          <w:szCs w:val="32"/>
+          <w:lang w:val="en-US"/>
+        </w:rPr>
+        <w:t>}</w:t>
+      </w:r>
+    </w:p>
+    <w:p>
+      <w:pPr>
+        <w:pStyle w:val="Normal"/>
+        <w:rPr>
+          <w:b w:val="false"/>
+          <w:b w:val="false"/>
+          <w:bCs w:val="false"/>
+          <w:sz w:val="32"/>
+          <w:szCs w:val="32"/>
+          <w:lang w:val="en-US"/>
+        </w:rPr>
+      </w:pPr>
+      <w:r>
+        <w:rPr>
+          <w:b w:val="false"/>
+          <w:bCs w:val="false"/>
+          <w:sz w:val="32"/>
+          <w:szCs w:val="32"/>
+          <w:lang w:val="en-US"/>
+        </w:rPr>
+        <w:t>}</w:t>
+      </w:r>
+    </w:p>
+    <w:p>
+      <w:pPr>
+        <w:pStyle w:val="Normal"/>
+        <w:rPr>
+          <w:b w:val="false"/>
+          <w:b w:val="false"/>
+          <w:bCs w:val="false"/>
+          <w:sz w:val="32"/>
+          <w:szCs w:val="32"/>
+          <w:lang w:val="en-US"/>
+        </w:rPr>
+      </w:pPr>
+      <w:r>
+        <w:rPr>
+          <w:b w:val="false"/>
+          <w:bCs w:val="false"/>
+          <w:sz w:val="32"/>
+          <w:szCs w:val="32"/>
+          <w:lang w:val="en-US"/>
+        </w:rPr>
+        <w:t>// Output the largest number</w:t>
+      </w:r>
+    </w:p>
+    <w:p>
+      <w:pPr>
+        <w:pStyle w:val="Normal"/>
+        <w:rPr>
+          <w:b w:val="false"/>
+          <w:b w:val="false"/>
+          <w:bCs w:val="false"/>
+          <w:sz w:val="32"/>
+          <w:szCs w:val="32"/>
+          <w:lang w:val="en-US"/>
+        </w:rPr>
+      </w:pPr>
+      <w:r>
+        <w:rPr>
+          <w:b w:val="false"/>
+          <w:bCs w:val="false"/>
+          <w:sz w:val="32"/>
+          <w:szCs w:val="32"/>
+          <w:lang w:val="en-US"/>
+        </w:rPr>
+        <w:t>Console.WriteLine("The largest number is: " + largest);</w:t>
+      </w:r>
+    </w:p>
+    <w:p>
+      <w:pPr>
+        <w:pStyle w:val="Normal"/>
+        <w:rPr>
+          <w:b/>
+          <w:b/>
+          <w:bCs/>
+          <w:sz w:val="32"/>
+          <w:szCs w:val="32"/>
+          <w:lang w:val="en-US"/>
+        </w:rPr>
+      </w:pPr>
+      <w:r>
+        <w:rPr>
+          <w:b/>
+          <w:bCs/>
+          <w:sz w:val="32"/>
+          <w:szCs w:val="32"/>
+          <w:lang w:val="en-US"/>
+        </w:rPr>
+      </w:r>
+    </w:p>
+    <w:p>
+      <w:pPr>
+        <w:pStyle w:val="Normal"/>
+        <w:rPr>
+          <w:b/>
+          <w:b/>
+          <w:bCs/>
+          <w:sz w:val="32"/>
+          <w:szCs w:val="32"/>
+          <w:lang w:val="en-US"/>
+        </w:rPr>
+      </w:pPr>
+      <w:r>
+        <w:rPr>
+          <w:b/>
+          <w:bCs/>
+          <w:sz w:val="32"/>
+          <w:szCs w:val="32"/>
+          <w:lang w:val="en-US"/>
+        </w:rPr>
+      </w:r>
+    </w:p>
+    <w:p>
+      <w:pPr>
+        <w:pStyle w:val="Heading1"/>
+        <w:rPr>
+          <w:b/>
+          <w:b/>
+          <w:bCs/>
+          <w:sz w:val="32"/>
+          <w:szCs w:val="32"/>
+          <w:lang w:val="en-US"/>
+        </w:rPr>
+      </w:pPr>
+      <w:r>
+        <w:rPr>
+          <w:b/>
+          <w:bCs/>
+          <w:sz w:val="32"/>
+          <w:szCs w:val="32"/>
+          <w:lang w:val="en-US"/>
+        </w:rPr>
+        <w:t>Example 2: Checking If a Number is Even or Odd</w:t>
+      </w:r>
+    </w:p>
+    <w:p>
+      <w:pPr>
+        <w:pStyle w:val="Heading2"/>
+        <w:rPr/>
+      </w:pPr>
+      <w:r>
+        <w:rPr/>
+        <w:t>Problem Statement:</w:t>
+      </w:r>
+    </w:p>
+    <w:p>
+      <w:pPr>
+        <w:pStyle w:val="TextBody"/>
+        <w:rPr/>
+      </w:pPr>
+      <w:r>
+        <w:rPr/>
+        <w:t>Write an algorithm to check if a given number is even or odd.</w:t>
+      </w:r>
+    </w:p>
+    <w:p>
+      <w:pPr>
+        <w:pStyle w:val="TextBody"/>
+        <w:rPr/>
+      </w:pPr>
+      <w:r>
+        <w:rPr/>
+        <w:t xml:space="preserve">1. Pseudocode: </w:t>
+      </w:r>
+    </w:p>
+    <w:p>
+      <w:pPr>
+        <w:pStyle w:val="TextBody"/>
+        <w:rPr/>
+      </w:pPr>
+      <w:r>
+        <w:rPr>
+          <w:rStyle w:val="Variable"/>
+        </w:rPr>
+        <w:t xml:space="preserve">Start Ask user for number If remainder of number divided by 2 is equal to 0 </w:t>
+      </w:r>
+      <w:r>
+        <w:rPr/>
+        <w:t>    </w:t>
+      </w:r>
+      <w:r>
+        <w:rPr>
+          <w:rStyle w:val="Variable"/>
+        </w:rPr>
+        <w:t xml:space="preserve">Display "Number is even" Otherwise </w:t>
+      </w:r>
+      <w:r>
+        <w:rPr/>
+        <w:t>    </w:t>
+      </w:r>
+      <w:r>
+        <w:rPr>
+          <w:rStyle w:val="Variable"/>
+        </w:rPr>
+        <w:t>Display "Number is odd" End</w:t>
+      </w:r>
+    </w:p>
+    <w:p>
+      <w:pPr>
+        <w:pStyle w:val="TextBody"/>
+        <w:rPr/>
+      </w:pPr>
+      <w:r>
+        <w:rPr/>
+        <w:t>2. Translation:</w:t>
+      </w:r>
+    </w:p>
+    <w:p>
+      <w:pPr>
+        <w:pStyle w:val="TextBody"/>
+        <w:numPr>
+          <w:ilvl w:val="0"/>
+          <w:numId w:val="23"/>
+        </w:numPr>
+        <w:tabs>
+          <w:tab w:val="clear" w:pos="708"/>
+          <w:tab w:val="left" w:pos="0" w:leader="none"/>
+        </w:tabs>
+        <w:ind w:left="709" w:hanging="283"/>
+        <w:rPr/>
+      </w:pPr>
+      <w:r>
+        <w:rPr/>
+        <w:t>Initialization: The variable number is set to 42.</w:t>
+      </w:r>
+    </w:p>
+    <w:p>
+      <w:pPr>
+        <w:pStyle w:val="TextBody"/>
+        <w:numPr>
+          <w:ilvl w:val="0"/>
+          <w:numId w:val="23"/>
+        </w:numPr>
+        <w:tabs>
+          <w:tab w:val="clear" w:pos="708"/>
+          <w:tab w:val="left" w:pos="0" w:leader="none"/>
+        </w:tabs>
+        <w:ind w:left="709" w:hanging="283"/>
+        <w:rPr/>
+      </w:pPr>
+      <w:r>
+        <w:rPr/>
+        <w:t>Condition Check: The if statement checks if the remainder of number divided by 2 is zero using the modulus operator %.</w:t>
+      </w:r>
+    </w:p>
+    <w:p>
+      <w:pPr>
+        <w:pStyle w:val="TextBody"/>
+        <w:numPr>
+          <w:ilvl w:val="0"/>
+          <w:numId w:val="23"/>
+        </w:numPr>
+        <w:tabs>
+          <w:tab w:val="clear" w:pos="708"/>
+          <w:tab w:val="left" w:pos="0" w:leader="none"/>
+        </w:tabs>
+        <w:ind w:left="709" w:hanging="283"/>
+        <w:rPr/>
+      </w:pPr>
+      <w:r>
+        <w:rPr/>
+        <w:t>Output: Based on the result of the condition, it prints either "The number is even." or "The number is odd.".</w:t>
+      </w:r>
+    </w:p>
+    <w:p>
+      <w:pPr>
+        <w:pStyle w:val="TextBody"/>
+        <w:rPr/>
+      </w:pPr>
+      <w:r>
+        <w:rPr/>
+        <w:t>3. C# Code:</w:t>
+      </w:r>
+    </w:p>
+    <w:p>
+      <w:pPr>
+        <w:pStyle w:val="Normal"/>
+        <w:rPr>
+          <w:b w:val="false"/>
+          <w:b w:val="false"/>
+          <w:bCs w:val="false"/>
+          <w:sz w:val="32"/>
+          <w:szCs w:val="32"/>
+          <w:lang w:val="en-US"/>
+        </w:rPr>
+      </w:pPr>
+      <w:r>
+        <w:rPr>
+          <w:b w:val="false"/>
+          <w:bCs w:val="false"/>
+          <w:sz w:val="32"/>
+          <w:szCs w:val="32"/>
+          <w:lang w:val="en-US"/>
+        </w:rPr>
+        <w:t>// Declare and initialize a number</w:t>
+      </w:r>
+    </w:p>
+    <w:p>
+      <w:pPr>
+        <w:pStyle w:val="Normal"/>
+        <w:rPr>
+          <w:b w:val="false"/>
+          <w:b w:val="false"/>
+          <w:bCs w:val="false"/>
+          <w:sz w:val="32"/>
+          <w:szCs w:val="32"/>
+          <w:lang w:val="en-US"/>
+        </w:rPr>
+      </w:pPr>
+      <w:r>
+        <w:rPr>
+          <w:b w:val="false"/>
+          <w:bCs w:val="false"/>
+          <w:sz w:val="32"/>
+          <w:szCs w:val="32"/>
+          <w:lang w:val="en-US"/>
+        </w:rPr>
+        <w:t>int number = 42;</w:t>
+      </w:r>
+    </w:p>
+    <w:p>
+      <w:pPr>
+        <w:pStyle w:val="Normal"/>
+        <w:rPr>
+          <w:b w:val="false"/>
+          <w:b w:val="false"/>
+          <w:bCs w:val="false"/>
+          <w:sz w:val="32"/>
+          <w:szCs w:val="32"/>
+          <w:lang w:val="en-US"/>
+        </w:rPr>
+      </w:pPr>
+      <w:r>
+        <w:rPr>
+          <w:b w:val="false"/>
+          <w:bCs w:val="false"/>
+          <w:sz w:val="32"/>
+          <w:szCs w:val="32"/>
+          <w:lang w:val="en-US"/>
+        </w:rPr>
+      </w:r>
+    </w:p>
+    <w:p>
+      <w:pPr>
+        <w:pStyle w:val="Normal"/>
+        <w:rPr>
+          <w:b w:val="false"/>
+          <w:b w:val="false"/>
+          <w:bCs w:val="false"/>
+          <w:sz w:val="32"/>
+          <w:szCs w:val="32"/>
+          <w:lang w:val="en-US"/>
+        </w:rPr>
+      </w:pPr>
+      <w:r>
+        <w:rPr>
+          <w:b w:val="false"/>
+          <w:bCs w:val="false"/>
+          <w:sz w:val="32"/>
+          <w:szCs w:val="32"/>
+          <w:lang w:val="en-US"/>
+        </w:rPr>
+      </w:r>
+    </w:p>
+    <w:p>
+      <w:pPr>
+        <w:pStyle w:val="Normal"/>
+        <w:rPr>
+          <w:b w:val="false"/>
+          <w:b w:val="false"/>
+          <w:bCs w:val="false"/>
+          <w:sz w:val="32"/>
+          <w:szCs w:val="32"/>
+          <w:lang w:val="en-US"/>
+        </w:rPr>
+      </w:pPr>
+      <w:r>
+        <w:rPr>
+          <w:b w:val="false"/>
+          <w:bCs w:val="false"/>
+          <w:sz w:val="32"/>
+          <w:szCs w:val="32"/>
+          <w:lang w:val="en-US"/>
+        </w:rPr>
+        <w:t>// Check if the number is even or odd</w:t>
+      </w:r>
+    </w:p>
+    <w:p>
+      <w:pPr>
+        <w:pStyle w:val="Normal"/>
+        <w:rPr>
+          <w:b w:val="false"/>
+          <w:b w:val="false"/>
+          <w:bCs w:val="false"/>
+          <w:sz w:val="32"/>
+          <w:szCs w:val="32"/>
+          <w:lang w:val="en-US"/>
+        </w:rPr>
+      </w:pPr>
+      <w:r>
+        <w:rPr>
+          <w:b w:val="false"/>
+          <w:bCs w:val="false"/>
+          <w:sz w:val="32"/>
+          <w:szCs w:val="32"/>
+          <w:lang w:val="en-US"/>
+        </w:rPr>
+        <w:t>if (number % 2 == 0)</w:t>
+      </w:r>
+    </w:p>
+    <w:p>
+      <w:pPr>
+        <w:pStyle w:val="Normal"/>
+        <w:rPr>
+          <w:b w:val="false"/>
+          <w:b w:val="false"/>
+          <w:bCs w:val="false"/>
+          <w:sz w:val="32"/>
+          <w:szCs w:val="32"/>
+          <w:lang w:val="en-US"/>
+        </w:rPr>
+      </w:pPr>
+      <w:r>
+        <w:rPr>
+          <w:b w:val="false"/>
+          <w:bCs w:val="false"/>
+          <w:sz w:val="32"/>
+          <w:szCs w:val="32"/>
+          <w:lang w:val="en-US"/>
+        </w:rPr>
+        <w:t>{</w:t>
+      </w:r>
+    </w:p>
+    <w:p>
+      <w:pPr>
+        <w:pStyle w:val="Normal"/>
+        <w:rPr>
+          <w:b w:val="false"/>
+          <w:b w:val="false"/>
+          <w:bCs w:val="false"/>
+          <w:sz w:val="32"/>
+          <w:szCs w:val="32"/>
+          <w:lang w:val="en-US"/>
+        </w:rPr>
+      </w:pPr>
+      <w:r>
+        <w:rPr>
+          <w:b w:val="false"/>
+          <w:bCs w:val="false"/>
+          <w:sz w:val="32"/>
+          <w:szCs w:val="32"/>
+          <w:lang w:val="en-US"/>
+        </w:rPr>
+        <w:t xml:space="preserve">    </w:t>
+      </w:r>
+      <w:r>
+        <w:rPr>
+          <w:b w:val="false"/>
+          <w:bCs w:val="false"/>
+          <w:sz w:val="32"/>
+          <w:szCs w:val="32"/>
+          <w:lang w:val="en-US"/>
+        </w:rPr>
+        <w:t>Console.WriteLine("The number is even.");</w:t>
+      </w:r>
+    </w:p>
+    <w:p>
+      <w:pPr>
+        <w:pStyle w:val="Normal"/>
+        <w:rPr>
+          <w:b w:val="false"/>
+          <w:b w:val="false"/>
+          <w:bCs w:val="false"/>
+          <w:sz w:val="32"/>
+          <w:szCs w:val="32"/>
+          <w:lang w:val="en-US"/>
+        </w:rPr>
+      </w:pPr>
+      <w:r>
+        <w:rPr>
+          <w:b w:val="false"/>
+          <w:bCs w:val="false"/>
+          <w:sz w:val="32"/>
+          <w:szCs w:val="32"/>
+          <w:lang w:val="en-US"/>
+        </w:rPr>
+        <w:t>}</w:t>
+      </w:r>
+    </w:p>
+    <w:p>
+      <w:pPr>
+        <w:pStyle w:val="Normal"/>
+        <w:rPr>
+          <w:b w:val="false"/>
+          <w:b w:val="false"/>
+          <w:bCs w:val="false"/>
+          <w:sz w:val="32"/>
+          <w:szCs w:val="32"/>
+          <w:lang w:val="en-US"/>
+        </w:rPr>
+      </w:pPr>
+      <w:r>
+        <w:rPr>
+          <w:b w:val="false"/>
+          <w:bCs w:val="false"/>
+          <w:sz w:val="32"/>
+          <w:szCs w:val="32"/>
+          <w:lang w:val="en-US"/>
+        </w:rPr>
+        <w:t>else</w:t>
+      </w:r>
+    </w:p>
+    <w:p>
+      <w:pPr>
+        <w:pStyle w:val="Normal"/>
+        <w:rPr>
+          <w:b w:val="false"/>
+          <w:b w:val="false"/>
+          <w:bCs w:val="false"/>
+          <w:sz w:val="32"/>
+          <w:szCs w:val="32"/>
+          <w:lang w:val="en-US"/>
+        </w:rPr>
+      </w:pPr>
+      <w:r>
+        <w:rPr>
+          <w:b w:val="false"/>
+          <w:bCs w:val="false"/>
+          <w:sz w:val="32"/>
+          <w:szCs w:val="32"/>
+          <w:lang w:val="en-US"/>
+        </w:rPr>
+        <w:t>{</w:t>
+      </w:r>
+    </w:p>
+    <w:p>
+      <w:pPr>
+        <w:pStyle w:val="Normal"/>
+        <w:rPr>
+          <w:b w:val="false"/>
+          <w:b w:val="false"/>
+          <w:bCs w:val="false"/>
+          <w:sz w:val="32"/>
+          <w:szCs w:val="32"/>
+          <w:lang w:val="en-US"/>
+        </w:rPr>
+      </w:pPr>
+      <w:r>
+        <w:rPr>
+          <w:b w:val="false"/>
+          <w:bCs w:val="false"/>
+          <w:sz w:val="32"/>
+          <w:szCs w:val="32"/>
+          <w:lang w:val="en-US"/>
+        </w:rPr>
+        <w:t xml:space="preserve">    </w:t>
+      </w:r>
+      <w:r>
+        <w:rPr>
+          <w:b w:val="false"/>
+          <w:bCs w:val="false"/>
+          <w:sz w:val="32"/>
+          <w:szCs w:val="32"/>
+          <w:lang w:val="en-US"/>
+        </w:rPr>
+        <w:t>Console.WriteLine("The number is odd.");</w:t>
+      </w:r>
+    </w:p>
+    <w:p>
+      <w:pPr>
+        <w:pStyle w:val="Normal"/>
+        <w:rPr>
+          <w:b w:val="false"/>
+          <w:b w:val="false"/>
+          <w:bCs w:val="false"/>
+          <w:sz w:val="32"/>
+          <w:szCs w:val="32"/>
+          <w:lang w:val="en-US"/>
+        </w:rPr>
+      </w:pPr>
+      <w:r>
+        <w:rPr>
+          <w:b w:val="false"/>
+          <w:bCs w:val="false"/>
+          <w:sz w:val="32"/>
+          <w:szCs w:val="32"/>
+          <w:lang w:val="en-US"/>
+        </w:rPr>
+        <w:t>}</w:t>
+      </w:r>
+    </w:p>
+    <w:p>
+      <w:pPr>
+        <w:pStyle w:val="Normal"/>
+        <w:rPr>
+          <w:b/>
+          <w:b/>
+          <w:bCs/>
+          <w:sz w:val="32"/>
+          <w:szCs w:val="32"/>
+          <w:lang w:val="en-US"/>
+        </w:rPr>
+      </w:pPr>
+      <w:r>
+        <w:rPr>
+          <w:b/>
+          <w:bCs/>
+          <w:sz w:val="32"/>
+          <w:szCs w:val="32"/>
+          <w:lang w:val="en-US"/>
+        </w:rPr>
+      </w:r>
+    </w:p>
+    <w:p>
+      <w:pPr>
+        <w:pStyle w:val="Normal"/>
+        <w:rPr>
+          <w:b/>
+          <w:b/>
+          <w:bCs/>
+          <w:sz w:val="32"/>
+          <w:szCs w:val="32"/>
+          <w:lang w:val="en-US"/>
+        </w:rPr>
+      </w:pPr>
+      <w:r>
+        <w:rPr>
+          <w:b/>
+          <w:bCs/>
+          <w:sz w:val="32"/>
+          <w:szCs w:val="32"/>
           <w:lang w:val="en-US"/>
         </w:rPr>
       </w:r>
@@ -6044,6 +8796,8 @@
           <w:b/>
           <w:b/>
           <w:bCs/>
+          <w:sz w:val="32"/>
+          <w:szCs w:val="32"/>
           <w:lang w:val="en-US"/>
         </w:rPr>
       </w:pPr>
@@ -6051,6 +8805,8 @@
         <w:rPr>
           <w:b/>
           <w:bCs/>
+          <w:sz w:val="32"/>
+          <w:szCs w:val="32"/>
           <w:lang w:val="en-US"/>
         </w:rPr>
       </w:r>
@@ -8849,6 +11605,280 @@
     </w:lvl>
   </w:abstractNum>
   <w:abstractNum w:abstractNumId="22">
+    <w:lvl w:ilvl="0">
+      <w:start w:val="1"/>
+      <w:numFmt w:val="bullet"/>
+      <w:lvlText w:val=""/>
+      <w:lvlJc w:val="left"/>
+      <w:pPr>
+        <w:tabs>
+          <w:tab w:val="num" w:pos="709"/>
+        </w:tabs>
+        <w:ind w:left="709" w:hanging="283"/>
+      </w:pPr>
+      <w:rPr>
+        <w:rFonts w:ascii="Symbol" w:hAnsi="Symbol" w:cs="Symbol" w:hint="default"/>
+      </w:rPr>
+    </w:lvl>
+    <w:lvl w:ilvl="1">
+      <w:start w:val="1"/>
+      <w:numFmt w:val="bullet"/>
+      <w:lvlText w:val=""/>
+      <w:lvlJc w:val="left"/>
+      <w:pPr>
+        <w:tabs>
+          <w:tab w:val="num" w:pos="1418"/>
+        </w:tabs>
+        <w:ind w:left="1418" w:hanging="283"/>
+      </w:pPr>
+      <w:rPr>
+        <w:rFonts w:ascii="Symbol" w:hAnsi="Symbol" w:cs="Symbol" w:hint="default"/>
+      </w:rPr>
+    </w:lvl>
+    <w:lvl w:ilvl="2">
+      <w:start w:val="1"/>
+      <w:numFmt w:val="bullet"/>
+      <w:lvlText w:val=""/>
+      <w:lvlJc w:val="left"/>
+      <w:pPr>
+        <w:tabs>
+          <w:tab w:val="num" w:pos="2127"/>
+        </w:tabs>
+        <w:ind w:left="2127" w:hanging="283"/>
+      </w:pPr>
+      <w:rPr>
+        <w:rFonts w:ascii="Symbol" w:hAnsi="Symbol" w:cs="Symbol" w:hint="default"/>
+      </w:rPr>
+    </w:lvl>
+    <w:lvl w:ilvl="3">
+      <w:start w:val="1"/>
+      <w:numFmt w:val="bullet"/>
+      <w:lvlText w:val=""/>
+      <w:lvlJc w:val="left"/>
+      <w:pPr>
+        <w:tabs>
+          <w:tab w:val="num" w:pos="2836"/>
+        </w:tabs>
+        <w:ind w:left="2836" w:hanging="283"/>
+      </w:pPr>
+      <w:rPr>
+        <w:rFonts w:ascii="Symbol" w:hAnsi="Symbol" w:cs="Symbol" w:hint="default"/>
+      </w:rPr>
+    </w:lvl>
+    <w:lvl w:ilvl="4">
+      <w:start w:val="1"/>
+      <w:numFmt w:val="bullet"/>
+      <w:lvlText w:val=""/>
+      <w:lvlJc w:val="left"/>
+      <w:pPr>
+        <w:tabs>
+          <w:tab w:val="num" w:pos="3545"/>
+        </w:tabs>
+        <w:ind w:left="3545" w:hanging="283"/>
+      </w:pPr>
+      <w:rPr>
+        <w:rFonts w:ascii="Symbol" w:hAnsi="Symbol" w:cs="Symbol" w:hint="default"/>
+      </w:rPr>
+    </w:lvl>
+    <w:lvl w:ilvl="5">
+      <w:start w:val="1"/>
+      <w:numFmt w:val="bullet"/>
+      <w:lvlText w:val=""/>
+      <w:lvlJc w:val="left"/>
+      <w:pPr>
+        <w:tabs>
+          <w:tab w:val="num" w:pos="4254"/>
+        </w:tabs>
+        <w:ind w:left="4254" w:hanging="283"/>
+      </w:pPr>
+      <w:rPr>
+        <w:rFonts w:ascii="Symbol" w:hAnsi="Symbol" w:cs="Symbol" w:hint="default"/>
+      </w:rPr>
+    </w:lvl>
+    <w:lvl w:ilvl="6">
+      <w:start w:val="1"/>
+      <w:numFmt w:val="bullet"/>
+      <w:lvlText w:val=""/>
+      <w:lvlJc w:val="left"/>
+      <w:pPr>
+        <w:tabs>
+          <w:tab w:val="num" w:pos="4963"/>
+        </w:tabs>
+        <w:ind w:left="4963" w:hanging="283"/>
+      </w:pPr>
+      <w:rPr>
+        <w:rFonts w:ascii="Symbol" w:hAnsi="Symbol" w:cs="Symbol" w:hint="default"/>
+      </w:rPr>
+    </w:lvl>
+    <w:lvl w:ilvl="7">
+      <w:start w:val="1"/>
+      <w:numFmt w:val="bullet"/>
+      <w:lvlText w:val=""/>
+      <w:lvlJc w:val="left"/>
+      <w:pPr>
+        <w:tabs>
+          <w:tab w:val="num" w:pos="5672"/>
+        </w:tabs>
+        <w:ind w:left="5672" w:hanging="283"/>
+      </w:pPr>
+      <w:rPr>
+        <w:rFonts w:ascii="Symbol" w:hAnsi="Symbol" w:cs="Symbol" w:hint="default"/>
+      </w:rPr>
+    </w:lvl>
+    <w:lvl w:ilvl="8">
+      <w:start w:val="1"/>
+      <w:numFmt w:val="bullet"/>
+      <w:lvlText w:val=""/>
+      <w:lvlJc w:val="left"/>
+      <w:pPr>
+        <w:tabs>
+          <w:tab w:val="num" w:pos="6381"/>
+        </w:tabs>
+        <w:ind w:left="6381" w:hanging="283"/>
+      </w:pPr>
+      <w:rPr>
+        <w:rFonts w:ascii="Symbol" w:hAnsi="Symbol" w:cs="Symbol" w:hint="default"/>
+      </w:rPr>
+    </w:lvl>
+  </w:abstractNum>
+  <w:abstractNum w:abstractNumId="23">
+    <w:lvl w:ilvl="0">
+      <w:start w:val="1"/>
+      <w:numFmt w:val="bullet"/>
+      <w:lvlText w:val=""/>
+      <w:lvlJc w:val="left"/>
+      <w:pPr>
+        <w:tabs>
+          <w:tab w:val="num" w:pos="709"/>
+        </w:tabs>
+        <w:ind w:left="709" w:hanging="283"/>
+      </w:pPr>
+      <w:rPr>
+        <w:rFonts w:ascii="Symbol" w:hAnsi="Symbol" w:cs="Symbol" w:hint="default"/>
+      </w:rPr>
+    </w:lvl>
+    <w:lvl w:ilvl="1">
+      <w:start w:val="1"/>
+      <w:numFmt w:val="bullet"/>
+      <w:lvlText w:val=""/>
+      <w:lvlJc w:val="left"/>
+      <w:pPr>
+        <w:tabs>
+          <w:tab w:val="num" w:pos="1418"/>
+        </w:tabs>
+        <w:ind w:left="1418" w:hanging="283"/>
+      </w:pPr>
+      <w:rPr>
+        <w:rFonts w:ascii="Symbol" w:hAnsi="Symbol" w:cs="Symbol" w:hint="default"/>
+      </w:rPr>
+    </w:lvl>
+    <w:lvl w:ilvl="2">
+      <w:start w:val="1"/>
+      <w:numFmt w:val="bullet"/>
+      <w:lvlText w:val=""/>
+      <w:lvlJc w:val="left"/>
+      <w:pPr>
+        <w:tabs>
+          <w:tab w:val="num" w:pos="2127"/>
+        </w:tabs>
+        <w:ind w:left="2127" w:hanging="283"/>
+      </w:pPr>
+      <w:rPr>
+        <w:rFonts w:ascii="Symbol" w:hAnsi="Symbol" w:cs="Symbol" w:hint="default"/>
+      </w:rPr>
+    </w:lvl>
+    <w:lvl w:ilvl="3">
+      <w:start w:val="1"/>
+      <w:numFmt w:val="bullet"/>
+      <w:lvlText w:val=""/>
+      <w:lvlJc w:val="left"/>
+      <w:pPr>
+        <w:tabs>
+          <w:tab w:val="num" w:pos="2836"/>
+        </w:tabs>
+        <w:ind w:left="2836" w:hanging="283"/>
+      </w:pPr>
+      <w:rPr>
+        <w:rFonts w:ascii="Symbol" w:hAnsi="Symbol" w:cs="Symbol" w:hint="default"/>
+      </w:rPr>
+    </w:lvl>
+    <w:lvl w:ilvl="4">
+      <w:start w:val="1"/>
+      <w:numFmt w:val="bullet"/>
+      <w:lvlText w:val=""/>
+      <w:lvlJc w:val="left"/>
+      <w:pPr>
+        <w:tabs>
+          <w:tab w:val="num" w:pos="3545"/>
+        </w:tabs>
+        <w:ind w:left="3545" w:hanging="283"/>
+      </w:pPr>
+      <w:rPr>
+        <w:rFonts w:ascii="Symbol" w:hAnsi="Symbol" w:cs="Symbol" w:hint="default"/>
+      </w:rPr>
+    </w:lvl>
+    <w:lvl w:ilvl="5">
+      <w:start w:val="1"/>
+      <w:numFmt w:val="bullet"/>
+      <w:lvlText w:val=""/>
+      <w:lvlJc w:val="left"/>
+      <w:pPr>
+        <w:tabs>
+          <w:tab w:val="num" w:pos="4254"/>
+        </w:tabs>
+        <w:ind w:left="4254" w:hanging="283"/>
+      </w:pPr>
+      <w:rPr>
+        <w:rFonts w:ascii="Symbol" w:hAnsi="Symbol" w:cs="Symbol" w:hint="default"/>
+      </w:rPr>
+    </w:lvl>
+    <w:lvl w:ilvl="6">
+      <w:start w:val="1"/>
+      <w:numFmt w:val="bullet"/>
+      <w:lvlText w:val=""/>
+      <w:lvlJc w:val="left"/>
+      <w:pPr>
+        <w:tabs>
+          <w:tab w:val="num" w:pos="4963"/>
+        </w:tabs>
+        <w:ind w:left="4963" w:hanging="283"/>
+      </w:pPr>
+      <w:rPr>
+        <w:rFonts w:ascii="Symbol" w:hAnsi="Symbol" w:cs="Symbol" w:hint="default"/>
+      </w:rPr>
+    </w:lvl>
+    <w:lvl w:ilvl="7">
+      <w:start w:val="1"/>
+      <w:numFmt w:val="bullet"/>
+      <w:lvlText w:val=""/>
+      <w:lvlJc w:val="left"/>
+      <w:pPr>
+        <w:tabs>
+          <w:tab w:val="num" w:pos="5672"/>
+        </w:tabs>
+        <w:ind w:left="5672" w:hanging="283"/>
+      </w:pPr>
+      <w:rPr>
+        <w:rFonts w:ascii="Symbol" w:hAnsi="Symbol" w:cs="Symbol" w:hint="default"/>
+      </w:rPr>
+    </w:lvl>
+    <w:lvl w:ilvl="8">
+      <w:start w:val="1"/>
+      <w:numFmt w:val="bullet"/>
+      <w:lvlText w:val=""/>
+      <w:lvlJc w:val="left"/>
+      <w:pPr>
+        <w:tabs>
+          <w:tab w:val="num" w:pos="6381"/>
+        </w:tabs>
+        <w:ind w:left="6381" w:hanging="283"/>
+      </w:pPr>
+      <w:rPr>
+        <w:rFonts w:ascii="Symbol" w:hAnsi="Symbol" w:cs="Symbol" w:hint="default"/>
+      </w:rPr>
+    </w:lvl>
+  </w:abstractNum>
+  <w:abstractNum w:abstractNumId="24">
     <w:lvl w:ilvl="0">
       <w:start w:val="1"/>
       <w:numFmt w:val="none"/>
@@ -9032,6 +12062,12 @@
   </w:num>
   <w:num w:numId="22">
     <w:abstractNumId w:val="22"/>
+  </w:num>
+  <w:num w:numId="23">
+    <w:abstractNumId w:val="23"/>
+  </w:num>
+  <w:num w:numId="24">
+    <w:abstractNumId w:val="24"/>
   </w:num>
 </w:numbering>
 </file>

</xml_diff>